<commit_message>
Change Docu with Code Snippets
</commit_message>
<xml_diff>
--- a/TicTacToe/Projekt_Doku/TicTacToe_Dokumentation.docx
+++ b/TicTacToe/Projekt_Doku/TicTacToe_Dokumentation.docx
@@ -2425,21 +2425,7 @@
                 <w:rStyle w:val="Hyperlink"/>
                 <w:noProof/>
               </w:rPr>
-              <w:t>9. Vollständige D</w:t>
-            </w:r>
-            <w:r>
-              <w:rPr>
-                <w:rStyle w:val="Hyperlink"/>
-                <w:noProof/>
-              </w:rPr>
-              <w:t>a</w:t>
-            </w:r>
-            <w:r>
-              <w:rPr>
-                <w:rStyle w:val="Hyperlink"/>
-                <w:noProof/>
-              </w:rPr>
-              <w:t>tei-Übersicht</w:t>
+              <w:t>9. Vollständige Datei-Übersicht</w:t>
             </w:r>
             <w:r>
               <w:rPr>
@@ -2545,12 +2531,6 @@
         <w:gridCol w:w="9360"/>
       </w:tblGrid>
       <w:tr>
-        <w:tblPrEx>
-          <w:tblCellMar>
-            <w:top w:w="0" w:type="dxa"/>
-            <w:bottom w:w="0" w:type="dxa"/>
-          </w:tblCellMar>
-        </w:tblPrEx>
         <w:tc>
           <w:tcPr>
             <w:tcW w:w="9360" w:type="dxa"/>
@@ -2581,12 +2561,6 @@
         </w:tc>
       </w:tr>
       <w:tr>
-        <w:tblPrEx>
-          <w:tblCellMar>
-            <w:top w:w="0" w:type="dxa"/>
-            <w:bottom w:w="0" w:type="dxa"/>
-          </w:tblCellMar>
-        </w:tblPrEx>
         <w:tc>
           <w:tcPr>
             <w:tcW w:w="9360" w:type="dxa"/>
@@ -2615,12 +2589,6 @@
         </w:tc>
       </w:tr>
       <w:tr>
-        <w:tblPrEx>
-          <w:tblCellMar>
-            <w:top w:w="0" w:type="dxa"/>
-            <w:bottom w:w="0" w:type="dxa"/>
-          </w:tblCellMar>
-        </w:tblPrEx>
         <w:tc>
           <w:tcPr>
             <w:tcW w:w="9360" w:type="dxa"/>
@@ -2649,12 +2617,6 @@
         </w:tc>
       </w:tr>
       <w:tr>
-        <w:tblPrEx>
-          <w:tblCellMar>
-            <w:top w:w="0" w:type="dxa"/>
-            <w:bottom w:w="0" w:type="dxa"/>
-          </w:tblCellMar>
-        </w:tblPrEx>
         <w:tc>
           <w:tcPr>
             <w:tcW w:w="9360" w:type="dxa"/>
@@ -2683,12 +2645,6 @@
         </w:tc>
       </w:tr>
       <w:tr>
-        <w:tblPrEx>
-          <w:tblCellMar>
-            <w:top w:w="0" w:type="dxa"/>
-            <w:bottom w:w="0" w:type="dxa"/>
-          </w:tblCellMar>
-        </w:tblPrEx>
         <w:tc>
           <w:tcPr>
             <w:tcW w:w="9360" w:type="dxa"/>
@@ -2731,12 +2687,6 @@
         </w:tc>
       </w:tr>
       <w:tr>
-        <w:tblPrEx>
-          <w:tblCellMar>
-            <w:top w:w="0" w:type="dxa"/>
-            <w:bottom w:w="0" w:type="dxa"/>
-          </w:tblCellMar>
-        </w:tblPrEx>
         <w:tc>
           <w:tcPr>
             <w:tcW w:w="9360" w:type="dxa"/>
@@ -3024,12 +2974,6 @@
         <w:gridCol w:w="3160"/>
       </w:tblGrid>
       <w:tr>
-        <w:tblPrEx>
-          <w:tblCellMar>
-            <w:top w:w="0" w:type="dxa"/>
-            <w:bottom w:w="0" w:type="dxa"/>
-          </w:tblCellMar>
-        </w:tblPrEx>
         <w:trPr>
           <w:tblHeader/>
         </w:trPr>
@@ -3126,12 +3070,6 @@
         </w:tc>
       </w:tr>
       <w:tr>
-        <w:tblPrEx>
-          <w:tblCellMar>
-            <w:top w:w="0" w:type="dxa"/>
-            <w:bottom w:w="0" w:type="dxa"/>
-          </w:tblCellMar>
-        </w:tblPrEx>
         <w:tc>
           <w:tcPr>
             <w:tcW w:w="2800" w:type="dxa"/>
@@ -3220,12 +3158,6 @@
         </w:tc>
       </w:tr>
       <w:tr>
-        <w:tblPrEx>
-          <w:tblCellMar>
-            <w:top w:w="0" w:type="dxa"/>
-            <w:bottom w:w="0" w:type="dxa"/>
-          </w:tblCellMar>
-        </w:tblPrEx>
         <w:tc>
           <w:tcPr>
             <w:tcW w:w="2800" w:type="dxa"/>
@@ -3322,12 +3254,6 @@
         </w:tc>
       </w:tr>
       <w:tr>
-        <w:tblPrEx>
-          <w:tblCellMar>
-            <w:top w:w="0" w:type="dxa"/>
-            <w:bottom w:w="0" w:type="dxa"/>
-          </w:tblCellMar>
-        </w:tblPrEx>
         <w:tc>
           <w:tcPr>
             <w:tcW w:w="2800" w:type="dxa"/>
@@ -3426,12 +3352,6 @@
         </w:tc>
       </w:tr>
       <w:tr>
-        <w:tblPrEx>
-          <w:tblCellMar>
-            <w:top w:w="0" w:type="dxa"/>
-            <w:bottom w:w="0" w:type="dxa"/>
-          </w:tblCellMar>
-        </w:tblPrEx>
         <w:tc>
           <w:tcPr>
             <w:tcW w:w="2800" w:type="dxa"/>
@@ -3538,12 +3458,6 @@
         </w:tc>
       </w:tr>
       <w:tr>
-        <w:tblPrEx>
-          <w:tblCellMar>
-            <w:top w:w="0" w:type="dxa"/>
-            <w:bottom w:w="0" w:type="dxa"/>
-          </w:tblCellMar>
-        </w:tblPrEx>
         <w:tc>
           <w:tcPr>
             <w:tcW w:w="2800" w:type="dxa"/>
@@ -3678,12 +3592,6 @@
         </w:tc>
       </w:tr>
       <w:tr>
-        <w:tblPrEx>
-          <w:tblCellMar>
-            <w:top w:w="0" w:type="dxa"/>
-            <w:bottom w:w="0" w:type="dxa"/>
-          </w:tblCellMar>
-        </w:tblPrEx>
         <w:tc>
           <w:tcPr>
             <w:tcW w:w="2800" w:type="dxa"/>
@@ -4047,12 +3955,6 @@
         <w:gridCol w:w="3960"/>
       </w:tblGrid>
       <w:tr>
-        <w:tblPrEx>
-          <w:tblCellMar>
-            <w:top w:w="0" w:type="dxa"/>
-            <w:bottom w:w="0" w:type="dxa"/>
-          </w:tblCellMar>
-        </w:tblPrEx>
         <w:trPr>
           <w:tblHeader/>
         </w:trPr>
@@ -4148,12 +4050,6 @@
         </w:tc>
       </w:tr>
       <w:tr>
-        <w:tblPrEx>
-          <w:tblCellMar>
-            <w:top w:w="0" w:type="dxa"/>
-            <w:bottom w:w="0" w:type="dxa"/>
-          </w:tblCellMar>
-        </w:tblPrEx>
         <w:tc>
           <w:tcPr>
             <w:tcW w:w="2000" w:type="dxa"/>
@@ -4260,12 +4156,6 @@
         </w:tc>
       </w:tr>
       <w:tr>
-        <w:tblPrEx>
-          <w:tblCellMar>
-            <w:top w:w="0" w:type="dxa"/>
-            <w:bottom w:w="0" w:type="dxa"/>
-          </w:tblCellMar>
-        </w:tblPrEx>
         <w:tc>
           <w:tcPr>
             <w:tcW w:w="2000" w:type="dxa"/>
@@ -4372,12 +4262,6 @@
         </w:tc>
       </w:tr>
       <w:tr>
-        <w:tblPrEx>
-          <w:tblCellMar>
-            <w:top w:w="0" w:type="dxa"/>
-            <w:bottom w:w="0" w:type="dxa"/>
-          </w:tblCellMar>
-        </w:tblPrEx>
         <w:tc>
           <w:tcPr>
             <w:tcW w:w="2000" w:type="dxa"/>
@@ -4855,12 +4739,6 @@
         <w:gridCol w:w="4560"/>
       </w:tblGrid>
       <w:tr>
-        <w:tblPrEx>
-          <w:tblCellMar>
-            <w:top w:w="0" w:type="dxa"/>
-            <w:bottom w:w="0" w:type="dxa"/>
-          </w:tblCellMar>
-        </w:tblPrEx>
         <w:trPr>
           <w:tblHeader/>
         </w:trPr>
@@ -4956,12 +4834,6 @@
         </w:tc>
       </w:tr>
       <w:tr>
-        <w:tblPrEx>
-          <w:tblCellMar>
-            <w:top w:w="0" w:type="dxa"/>
-            <w:bottom w:w="0" w:type="dxa"/>
-          </w:tblCellMar>
-        </w:tblPrEx>
         <w:tc>
           <w:tcPr>
             <w:tcW w:w="2400" w:type="dxa"/>
@@ -5048,12 +4920,6 @@
         </w:tc>
       </w:tr>
       <w:tr>
-        <w:tblPrEx>
-          <w:tblCellMar>
-            <w:top w:w="0" w:type="dxa"/>
-            <w:bottom w:w="0" w:type="dxa"/>
-          </w:tblCellMar>
-        </w:tblPrEx>
         <w:tc>
           <w:tcPr>
             <w:tcW w:w="2400" w:type="dxa"/>
@@ -5140,12 +5006,6 @@
         </w:tc>
       </w:tr>
       <w:tr>
-        <w:tblPrEx>
-          <w:tblCellMar>
-            <w:top w:w="0" w:type="dxa"/>
-            <w:bottom w:w="0" w:type="dxa"/>
-          </w:tblCellMar>
-        </w:tblPrEx>
         <w:tc>
           <w:tcPr>
             <w:tcW w:w="2400" w:type="dxa"/>
@@ -5279,6 +5139,170 @@
       </w:r>
       <w:r>
         <w:t xml:space="preserve"> – gibt das Symbol des Gegenspielers zurück (X→O, O→X).</w:t>
+      </w:r>
+    </w:p>
+    <w:p>
+      <w:pPr>
+        <w:spacing w:before="60" w:after="120"/>
+      </w:pPr>
+    </w:p>
+    <w:p>
+      <w:pPr>
+        <w:spacing w:before="60" w:after="120"/>
+      </w:pPr>
+      <w:r>
+        <w:drawing>
+          <wp:inline distT="0" distB="0" distL="0" distR="0" wp14:anchorId="5233D3A5" wp14:editId="294B4100">
+            <wp:extent cx="5772956" cy="866896"/>
+            <wp:effectExtent l="0" t="0" r="0" b="9525"/>
+            <wp:docPr id="1808721620" name="Grafik 1"/>
+            <wp:cNvGraphicFramePr>
+              <a:graphicFrameLocks xmlns:a="http://schemas.openxmlformats.org/drawingml/2006/main" noChangeAspect="1"/>
+            </wp:cNvGraphicFramePr>
+            <a:graphic xmlns:a="http://schemas.openxmlformats.org/drawingml/2006/main">
+              <a:graphicData uri="http://schemas.openxmlformats.org/drawingml/2006/picture">
+                <pic:pic xmlns:pic="http://schemas.openxmlformats.org/drawingml/2006/picture">
+                  <pic:nvPicPr>
+                    <pic:cNvPr id="1808721620" name=""/>
+                    <pic:cNvPicPr/>
+                  </pic:nvPicPr>
+                  <pic:blipFill>
+                    <a:blip r:embed="rId8"/>
+                    <a:stretch>
+                      <a:fillRect/>
+                    </a:stretch>
+                  </pic:blipFill>
+                  <pic:spPr>
+                    <a:xfrm>
+                      <a:off x="0" y="0"/>
+                      <a:ext cx="5772956" cy="866896"/>
+                    </a:xfrm>
+                    <a:prstGeom prst="rect">
+                      <a:avLst/>
+                    </a:prstGeom>
+                  </pic:spPr>
+                </pic:pic>
+              </a:graphicData>
+            </a:graphic>
+          </wp:inline>
+        </w:drawing>
+      </w:r>
+    </w:p>
+    <w:p>
+      <w:pPr>
+        <w:spacing w:before="60" w:after="120"/>
+      </w:pPr>
+      <w:r>
+        <w:t>Die Methode übernimmt folgende Aufgaben:</w:t>
+      </w:r>
+    </w:p>
+    <w:p>
+      <w:pPr>
+        <w:numPr>
+          <w:ilvl w:val="0"/>
+          <w:numId w:val="5"/>
+        </w:numPr>
+        <w:spacing w:before="60" w:after="120"/>
+      </w:pPr>
+      <w:r>
+        <w:t>Sie erkennt anhand des aktuellen Symbols, welcher Spieler als Nächstes am Zug ist.</w:t>
+      </w:r>
+    </w:p>
+    <w:p>
+      <w:pPr>
+        <w:numPr>
+          <w:ilvl w:val="0"/>
+          <w:numId w:val="5"/>
+        </w:numPr>
+        <w:spacing w:before="60" w:after="120"/>
+      </w:pPr>
+      <w:r>
+        <w:t xml:space="preserve">Sie verhindert ungültige Aufrufe, indem sie bei LEER eine </w:t>
+      </w:r>
+      <w:proofErr w:type="spellStart"/>
+      <w:r>
+        <w:t>Exception</w:t>
+      </w:r>
+      <w:proofErr w:type="spellEnd"/>
+      <w:r>
+        <w:t xml:space="preserve"> wirft.</w:t>
+      </w:r>
+    </w:p>
+    <w:p>
+      <w:pPr>
+        <w:numPr>
+          <w:ilvl w:val="0"/>
+          <w:numId w:val="5"/>
+        </w:numPr>
+        <w:spacing w:before="60" w:after="120"/>
+      </w:pPr>
+      <w:r>
+        <w:lastRenderedPageBreak/>
+        <w:t>Sie stellt sicher, dass der Wechsel zwischen X und O konsistent und zentral gesteuert wird.</w:t>
+      </w:r>
+    </w:p>
+    <w:p>
+      <w:pPr>
+        <w:spacing w:before="60" w:after="120"/>
+      </w:pPr>
+      <w:r>
+        <w:rPr>
+          <w:b/>
+          <w:bCs/>
+        </w:rPr>
+        <w:t>Vorteile dieser Lösung:</w:t>
+      </w:r>
+    </w:p>
+    <w:p>
+      <w:pPr>
+        <w:numPr>
+          <w:ilvl w:val="0"/>
+          <w:numId w:val="6"/>
+        </w:numPr>
+        <w:spacing w:before="60" w:after="120"/>
+      </w:pPr>
+      <w:r>
+        <w:t>Hohe Lesbarkeit: Der Code an anderen Stellen muss nicht wissen, wie der Spielerwechsel funktioniert.</w:t>
+      </w:r>
+    </w:p>
+    <w:p>
+      <w:pPr>
+        <w:numPr>
+          <w:ilvl w:val="0"/>
+          <w:numId w:val="6"/>
+        </w:numPr>
+        <w:spacing w:before="60" w:after="120"/>
+      </w:pPr>
+      <w:r>
+        <w:t>Fehlervermeidung: Ungültige Zustände werden frühzeitig abgefangen.</w:t>
+      </w:r>
+    </w:p>
+    <w:p>
+      <w:pPr>
+        <w:numPr>
+          <w:ilvl w:val="0"/>
+          <w:numId w:val="6"/>
+        </w:numPr>
+        <w:spacing w:before="60" w:after="120"/>
+      </w:pPr>
+      <w:r>
+        <w:t>Saubere Architektur: Die Spiellogik bleibt dort, wo sie hingehört – beim Symbol selbst.</w:t>
+      </w:r>
+    </w:p>
+    <w:p>
+      <w:pPr>
+        <w:spacing w:before="60" w:after="120"/>
+      </w:pPr>
+      <w:r>
+        <w:t xml:space="preserve">Diese Methode trägt wesentlich zur Stabilität und Wartbarkeit des gesamten Spiels bei und ist ein gutes Beispiel für die sinnvolle Nutzung von </w:t>
+      </w:r>
+      <w:proofErr w:type="spellStart"/>
+      <w:r>
+        <w:t>Enums</w:t>
+      </w:r>
+      <w:proofErr w:type="spellEnd"/>
+      <w:r>
+        <w:t xml:space="preserve"> in Java.</w:t>
       </w:r>
     </w:p>
     <w:p/>
@@ -5328,12 +5352,6 @@
         <w:gridCol w:w="4360"/>
       </w:tblGrid>
       <w:tr>
-        <w:tblPrEx>
-          <w:tblCellMar>
-            <w:top w:w="0" w:type="dxa"/>
-            <w:bottom w:w="0" w:type="dxa"/>
-          </w:tblCellMar>
-        </w:tblPrEx>
         <w:trPr>
           <w:tblHeader/>
         </w:trPr>
@@ -5429,12 +5447,6 @@
         </w:tc>
       </w:tr>
       <w:tr>
-        <w:tblPrEx>
-          <w:tblCellMar>
-            <w:top w:w="0" w:type="dxa"/>
-            <w:bottom w:w="0" w:type="dxa"/>
-          </w:tblCellMar>
-        </w:tblPrEx>
         <w:tc>
           <w:tcPr>
             <w:tcW w:w="3200" w:type="dxa"/>
@@ -5543,12 +5555,6 @@
         </w:tc>
       </w:tr>
       <w:tr>
-        <w:tblPrEx>
-          <w:tblCellMar>
-            <w:top w:w="0" w:type="dxa"/>
-            <w:bottom w:w="0" w:type="dxa"/>
-          </w:tblCellMar>
-        </w:tblPrEx>
         <w:tc>
           <w:tcPr>
             <w:tcW w:w="3200" w:type="dxa"/>
@@ -5685,12 +5691,6 @@
         </w:tc>
       </w:tr>
       <w:tr>
-        <w:tblPrEx>
-          <w:tblCellMar>
-            <w:top w:w="0" w:type="dxa"/>
-            <w:bottom w:w="0" w:type="dxa"/>
-          </w:tblCellMar>
-        </w:tblPrEx>
         <w:tc>
           <w:tcPr>
             <w:tcW w:w="3200" w:type="dxa"/>
@@ -5807,12 +5807,6 @@
         </w:tc>
       </w:tr>
       <w:tr>
-        <w:tblPrEx>
-          <w:tblCellMar>
-            <w:top w:w="0" w:type="dxa"/>
-            <w:bottom w:w="0" w:type="dxa"/>
-          </w:tblCellMar>
-        </w:tblPrEx>
         <w:tc>
           <w:tcPr>
             <w:tcW w:w="3200" w:type="dxa"/>
@@ -5839,7 +5833,6 @@
                 <w:sz w:val="20"/>
                 <w:szCs w:val="20"/>
               </w:rPr>
-              <w:lastRenderedPageBreak/>
               <w:t>istUnentschieden</w:t>
             </w:r>
             <w:proofErr w:type="spellEnd"/>
@@ -5932,12 +5925,6 @@
         </w:tc>
       </w:tr>
       <w:tr>
-        <w:tblPrEx>
-          <w:tblCellMar>
-            <w:top w:w="0" w:type="dxa"/>
-            <w:bottom w:w="0" w:type="dxa"/>
-          </w:tblCellMar>
-        </w:tblPrEx>
         <w:tc>
           <w:tcPr>
             <w:tcW w:w="3200" w:type="dxa"/>
@@ -6056,12 +6043,6 @@
         </w:tc>
       </w:tr>
       <w:tr>
-        <w:tblPrEx>
-          <w:tblCellMar>
-            <w:top w:w="0" w:type="dxa"/>
-            <w:bottom w:w="0" w:type="dxa"/>
-          </w:tblCellMar>
-        </w:tblPrEx>
         <w:tc>
           <w:tcPr>
             <w:tcW w:w="3200" w:type="dxa"/>
@@ -6170,12 +6151,6 @@
         </w:tc>
       </w:tr>
       <w:tr>
-        <w:tblPrEx>
-          <w:tblCellMar>
-            <w:top w:w="0" w:type="dxa"/>
-            <w:bottom w:w="0" w:type="dxa"/>
-          </w:tblCellMar>
-        </w:tblPrEx>
         <w:tc>
           <w:tcPr>
             <w:tcW w:w="3200" w:type="dxa"/>
@@ -6284,6 +6259,137 @@
         </w:tc>
       </w:tr>
     </w:tbl>
+    <w:p/>
+    <w:p>
+      <w:r>
+        <w:lastRenderedPageBreak/>
+        <w:drawing>
+          <wp:inline distT="0" distB="0" distL="0" distR="0" wp14:anchorId="3B46CB96" wp14:editId="77C50889">
+            <wp:extent cx="5943600" cy="3021330"/>
+            <wp:effectExtent l="0" t="0" r="0" b="7620"/>
+            <wp:docPr id="926785899" name="Grafik 1"/>
+            <wp:cNvGraphicFramePr>
+              <a:graphicFrameLocks xmlns:a="http://schemas.openxmlformats.org/drawingml/2006/main" noChangeAspect="1"/>
+            </wp:cNvGraphicFramePr>
+            <a:graphic xmlns:a="http://schemas.openxmlformats.org/drawingml/2006/main">
+              <a:graphicData uri="http://schemas.openxmlformats.org/drawingml/2006/picture">
+                <pic:pic xmlns:pic="http://schemas.openxmlformats.org/drawingml/2006/picture">
+                  <pic:nvPicPr>
+                    <pic:cNvPr id="926785899" name=""/>
+                    <pic:cNvPicPr/>
+                  </pic:nvPicPr>
+                  <pic:blipFill>
+                    <a:blip r:embed="rId9"/>
+                    <a:stretch>
+                      <a:fillRect/>
+                    </a:stretch>
+                  </pic:blipFill>
+                  <pic:spPr>
+                    <a:xfrm>
+                      <a:off x="0" y="0"/>
+                      <a:ext cx="5943600" cy="3021330"/>
+                    </a:xfrm>
+                    <a:prstGeom prst="rect">
+                      <a:avLst/>
+                    </a:prstGeom>
+                  </pic:spPr>
+                </pic:pic>
+              </a:graphicData>
+            </a:graphic>
+          </wp:inline>
+        </w:drawing>
+      </w:r>
+    </w:p>
+    <w:p/>
+    <w:p>
+      <w:r>
+        <w:rPr>
+          <w:b/>
+          <w:bCs/>
+        </w:rPr>
+        <w:t>Aufgaben der Methode:</w:t>
+      </w:r>
+    </w:p>
+    <w:p>
+      <w:pPr>
+        <w:numPr>
+          <w:ilvl w:val="0"/>
+          <w:numId w:val="7"/>
+        </w:numPr>
+      </w:pPr>
+      <w:r>
+        <w:t>Validierung des Zugs: Es wird geprüft, ob das Spiel bereits beendet ist oder das gewählte Feld schon belegt wurde. Ungültige Züge werden konsequent abgelehnt.</w:t>
+      </w:r>
+    </w:p>
+    <w:p>
+      <w:pPr>
+        <w:numPr>
+          <w:ilvl w:val="0"/>
+          <w:numId w:val="7"/>
+        </w:numPr>
+      </w:pPr>
+      <w:r>
+        <w:t>Setzen des Spielersymbols: Das Symbol des aktuellen Spielers wird in das entsprechende Feld eingetragen.</w:t>
+      </w:r>
+    </w:p>
+    <w:p>
+      <w:pPr>
+        <w:numPr>
+          <w:ilvl w:val="0"/>
+          <w:numId w:val="7"/>
+        </w:numPr>
+      </w:pPr>
+      <w:r>
+        <w:t>Zugzähler aktualisieren: Die Methode erhöht die Anzahl der gesetzten Züge, was später für die Unentschieden</w:t>
+      </w:r>
+      <w:r>
+        <w:noBreakHyphen/>
+        <w:t>Erkennung wichtig ist.</w:t>
+      </w:r>
+    </w:p>
+    <w:p>
+      <w:pPr>
+        <w:numPr>
+          <w:ilvl w:val="0"/>
+          <w:numId w:val="7"/>
+        </w:numPr>
+      </w:pPr>
+      <w:r>
+        <w:t>Gewinnerprüfung: Nach jedem Zug wird überprüft, ob der aktuelle Spieler gewonnen hat. Falls ja, wird das Spiel sofort beendet.</w:t>
+      </w:r>
+    </w:p>
+    <w:p>
+      <w:pPr>
+        <w:numPr>
+          <w:ilvl w:val="0"/>
+          <w:numId w:val="7"/>
+        </w:numPr>
+      </w:pPr>
+      <w:r>
+        <w:t>Unentschieden-Erkennung: Wenn alle Felder belegt sind und kein Spieler gewonnen hat, wird das Spiel ebenfalls beendet.</w:t>
+      </w:r>
+    </w:p>
+    <w:p>
+      <w:pPr>
+        <w:numPr>
+          <w:ilvl w:val="0"/>
+          <w:numId w:val="7"/>
+        </w:numPr>
+      </w:pPr>
+      <w:r>
+        <w:t xml:space="preserve">Automatischer Spielerwechsel: Nur wenn das Spiel </w:t>
+      </w:r>
+      <w:r>
+        <w:rPr>
+          <w:i/>
+          <w:iCs/>
+        </w:rPr>
+        <w:t>nicht</w:t>
+      </w:r>
+      <w:r>
+        <w:t xml:space="preserve"> beendet ist, wird der Spieler gewechselt. Dadurch bleibt die Spiellogik klar strukturiert und fehlerfrei.</w:t>
+      </w:r>
+    </w:p>
     <w:p/>
     <w:p>
       <w:pPr>
@@ -6367,12 +6473,6 @@
         <w:gridCol w:w="5760"/>
       </w:tblGrid>
       <w:tr>
-        <w:tblPrEx>
-          <w:tblCellMar>
-            <w:top w:w="0" w:type="dxa"/>
-            <w:bottom w:w="0" w:type="dxa"/>
-          </w:tblCellMar>
-        </w:tblPrEx>
         <w:trPr>
           <w:tblHeader/>
         </w:trPr>
@@ -6438,12 +6538,6 @@
         </w:tc>
       </w:tr>
       <w:tr>
-        <w:tblPrEx>
-          <w:tblCellMar>
-            <w:top w:w="0" w:type="dxa"/>
-            <w:bottom w:w="0" w:type="dxa"/>
-          </w:tblCellMar>
-        </w:tblPrEx>
         <w:tc>
           <w:tcPr>
             <w:tcW w:w="3600" w:type="dxa"/>
@@ -6548,12 +6642,6 @@
         </w:tc>
       </w:tr>
       <w:tr>
-        <w:tblPrEx>
-          <w:tblCellMar>
-            <w:top w:w="0" w:type="dxa"/>
-            <w:bottom w:w="0" w:type="dxa"/>
-          </w:tblCellMar>
-        </w:tblPrEx>
         <w:tc>
           <w:tcPr>
             <w:tcW w:w="3600" w:type="dxa"/>
@@ -6660,12 +6748,6 @@
         </w:tc>
       </w:tr>
       <w:tr>
-        <w:tblPrEx>
-          <w:tblCellMar>
-            <w:top w:w="0" w:type="dxa"/>
-            <w:bottom w:w="0" w:type="dxa"/>
-          </w:tblCellMar>
-        </w:tblPrEx>
         <w:tc>
           <w:tcPr>
             <w:tcW w:w="3600" w:type="dxa"/>
@@ -6744,12 +6826,6 @@
         </w:tc>
       </w:tr>
       <w:tr>
-        <w:tblPrEx>
-          <w:tblCellMar>
-            <w:top w:w="0" w:type="dxa"/>
-            <w:bottom w:w="0" w:type="dxa"/>
-          </w:tblCellMar>
-        </w:tblPrEx>
         <w:tc>
           <w:tcPr>
             <w:tcW w:w="3600" w:type="dxa"/>
@@ -6884,6 +6960,7 @@
         <w:spacing w:before="40" w:after="40"/>
       </w:pPr>
       <w:r>
+        <w:lastRenderedPageBreak/>
         <w:t>Spieler X: #F38BA8 (</w:t>
       </w:r>
       <w:proofErr w:type="gramStart"/>
@@ -6893,6 +6970,148 @@
       <w:proofErr w:type="gramEnd"/>
       <w:r>
         <w:t xml:space="preserve">  Spieler O: #89DCEB (Hellblau)</w:t>
+      </w:r>
+    </w:p>
+    <w:p>
+      <w:pPr>
+        <w:spacing w:before="40" w:after="40"/>
+      </w:pPr>
+    </w:p>
+    <w:p>
+      <w:pPr>
+        <w:spacing w:before="40" w:after="40"/>
+      </w:pPr>
+      <w:r>
+        <w:drawing>
+          <wp:inline distT="0" distB="0" distL="0" distR="0" wp14:anchorId="2699E785" wp14:editId="3C5A445C">
+            <wp:extent cx="5943600" cy="1863725"/>
+            <wp:effectExtent l="0" t="0" r="0" b="3175"/>
+            <wp:docPr id="2070570995" name="Grafik 1"/>
+            <wp:cNvGraphicFramePr>
+              <a:graphicFrameLocks xmlns:a="http://schemas.openxmlformats.org/drawingml/2006/main" noChangeAspect="1"/>
+            </wp:cNvGraphicFramePr>
+            <a:graphic xmlns:a="http://schemas.openxmlformats.org/drawingml/2006/main">
+              <a:graphicData uri="http://schemas.openxmlformats.org/drawingml/2006/picture">
+                <pic:pic xmlns:pic="http://schemas.openxmlformats.org/drawingml/2006/picture">
+                  <pic:nvPicPr>
+                    <pic:cNvPr id="2070570995" name=""/>
+                    <pic:cNvPicPr/>
+                  </pic:nvPicPr>
+                  <pic:blipFill>
+                    <a:blip r:embed="rId10"/>
+                    <a:stretch>
+                      <a:fillRect/>
+                    </a:stretch>
+                  </pic:blipFill>
+                  <pic:spPr>
+                    <a:xfrm>
+                      <a:off x="0" y="0"/>
+                      <a:ext cx="5943600" cy="1863725"/>
+                    </a:xfrm>
+                    <a:prstGeom prst="rect">
+                      <a:avLst/>
+                    </a:prstGeom>
+                  </pic:spPr>
+                </pic:pic>
+              </a:graphicData>
+            </a:graphic>
+          </wp:inline>
+        </w:drawing>
+      </w:r>
+    </w:p>
+    <w:p>
+      <w:pPr>
+        <w:spacing w:before="40" w:after="40"/>
+      </w:pPr>
+      <w:r>
+        <w:rPr>
+          <w:b/>
+          <w:bCs/>
+        </w:rPr>
+        <w:t>Aufgaben der Methode:</w:t>
+      </w:r>
+    </w:p>
+    <w:p>
+      <w:pPr>
+        <w:numPr>
+          <w:ilvl w:val="0"/>
+          <w:numId w:val="8"/>
+        </w:numPr>
+        <w:spacing w:before="40" w:after="40"/>
+      </w:pPr>
+      <w:r>
+        <w:t xml:space="preserve">Registrierung eines </w:t>
+      </w:r>
+      <w:proofErr w:type="spellStart"/>
+      <w:r>
+        <w:t>ActionListeners</w:t>
+      </w:r>
+      <w:proofErr w:type="spellEnd"/>
+      <w:r>
+        <w:t xml:space="preserve">: Der Controller übergibt einen </w:t>
+      </w:r>
+      <w:proofErr w:type="spellStart"/>
+      <w:r>
+        <w:t>Listener</w:t>
+      </w:r>
+      <w:proofErr w:type="spellEnd"/>
+      <w:r>
+        <w:t xml:space="preserve">, der </w:t>
+      </w:r>
+      <w:proofErr w:type="gramStart"/>
+      <w:r>
+        <w:t>auf alle Button</w:t>
+      </w:r>
+      <w:proofErr w:type="gramEnd"/>
+      <w:r>
+        <w:noBreakHyphen/>
+        <w:t>Klicks reagiert.</w:t>
+      </w:r>
+    </w:p>
+    <w:p>
+      <w:pPr>
+        <w:numPr>
+          <w:ilvl w:val="0"/>
+          <w:numId w:val="8"/>
+        </w:numPr>
+        <w:spacing w:before="40" w:after="40"/>
+      </w:pPr>
+      <w:r>
+        <w:t xml:space="preserve">Codierung der Position: Jeder Button erhält einen </w:t>
+      </w:r>
+      <w:proofErr w:type="spellStart"/>
+      <w:r>
+        <w:t>ActionCommand</w:t>
+      </w:r>
+      <w:proofErr w:type="spellEnd"/>
+      <w:r>
+        <w:t xml:space="preserve"> im Format "</w:t>
+      </w:r>
+      <w:proofErr w:type="spellStart"/>
+      <w:proofErr w:type="gramStart"/>
+      <w:r>
+        <w:t>zeile,spalte</w:t>
+      </w:r>
+      <w:proofErr w:type="spellEnd"/>
+      <w:proofErr w:type="gramEnd"/>
+      <w:r>
+        <w:t>". Dadurch weiß der Controller genau, welches Feld angeklickt wurde, ohne dass die GUI selbst Spiellogik kennen muss.</w:t>
+      </w:r>
+    </w:p>
+    <w:p>
+      <w:pPr>
+        <w:numPr>
+          <w:ilvl w:val="0"/>
+          <w:numId w:val="8"/>
+        </w:numPr>
+        <w:spacing w:before="40" w:after="40"/>
+      </w:pPr>
+      <w:r>
+        <w:t>Entkopplung von GUI und Logik: Die GUI führt keine Spielregeln aus und trifft keine Entscheidungen. Sie meldet nur Ereignisse weiter — ein sauberes MVC</w:t>
+      </w:r>
+      <w:r>
+        <w:noBreakHyphen/>
+        <w:t>ähnliches Design.</w:t>
       </w:r>
     </w:p>
     <w:p/>
@@ -7274,6 +7493,216 @@
     </w:p>
     <w:p/>
     <w:p>
+      <w:r>
+        <w:lastRenderedPageBreak/>
+        <w:drawing>
+          <wp:inline distT="0" distB="0" distL="0" distR="0" wp14:anchorId="6C2AEB7B" wp14:editId="3E51FE03">
+            <wp:extent cx="5943600" cy="6285865"/>
+            <wp:effectExtent l="0" t="0" r="0" b="635"/>
+            <wp:docPr id="1412120150" name="Grafik 1"/>
+            <wp:cNvGraphicFramePr>
+              <a:graphicFrameLocks xmlns:a="http://schemas.openxmlformats.org/drawingml/2006/main" noChangeAspect="1"/>
+            </wp:cNvGraphicFramePr>
+            <a:graphic xmlns:a="http://schemas.openxmlformats.org/drawingml/2006/main">
+              <a:graphicData uri="http://schemas.openxmlformats.org/drawingml/2006/picture">
+                <pic:pic xmlns:pic="http://schemas.openxmlformats.org/drawingml/2006/picture">
+                  <pic:nvPicPr>
+                    <pic:cNvPr id="1412120150" name=""/>
+                    <pic:cNvPicPr/>
+                  </pic:nvPicPr>
+                  <pic:blipFill>
+                    <a:blip r:embed="rId11"/>
+                    <a:stretch>
+                      <a:fillRect/>
+                    </a:stretch>
+                  </pic:blipFill>
+                  <pic:spPr>
+                    <a:xfrm>
+                      <a:off x="0" y="0"/>
+                      <a:ext cx="5943600" cy="6285865"/>
+                    </a:xfrm>
+                    <a:prstGeom prst="rect">
+                      <a:avLst/>
+                    </a:prstGeom>
+                  </pic:spPr>
+                </pic:pic>
+              </a:graphicData>
+            </a:graphic>
+          </wp:inline>
+        </w:drawing>
+      </w:r>
+    </w:p>
+    <w:p/>
+    <w:p>
+      <w:pPr>
+        <w:rPr>
+          <w:b/>
+          <w:bCs/>
+        </w:rPr>
+      </w:pPr>
+      <w:r>
+        <w:rPr>
+          <w:b/>
+          <w:bCs/>
+        </w:rPr>
+        <w:t xml:space="preserve">Aufgaben der Methode </w:t>
+      </w:r>
+      <w:proofErr w:type="spellStart"/>
+      <w:proofErr w:type="gramStart"/>
+      <w:r>
+        <w:rPr>
+          <w:b/>
+          <w:bCs/>
+        </w:rPr>
+        <w:t>actionPerformed</w:t>
+      </w:r>
+      <w:proofErr w:type="spellEnd"/>
+      <w:r>
+        <w:rPr>
+          <w:b/>
+          <w:bCs/>
+        </w:rPr>
+        <w:t>(</w:t>
+      </w:r>
+      <w:proofErr w:type="gramEnd"/>
+      <w:r>
+        <w:rPr>
+          <w:b/>
+          <w:bCs/>
+        </w:rPr>
+        <w:t>)</w:t>
+      </w:r>
+    </w:p>
+    <w:p>
+      <w:pPr>
+        <w:numPr>
+          <w:ilvl w:val="0"/>
+          <w:numId w:val="9"/>
+        </w:numPr>
+      </w:pPr>
+      <w:r>
+        <w:t xml:space="preserve">Auslesen der Benutzeraktion: Jeder Button im Spielfeld besitzt einen </w:t>
+      </w:r>
+      <w:proofErr w:type="spellStart"/>
+      <w:r>
+        <w:t>ActionCommand</w:t>
+      </w:r>
+      <w:proofErr w:type="spellEnd"/>
+      <w:r>
+        <w:t xml:space="preserve"> im Format "</w:t>
+      </w:r>
+      <w:proofErr w:type="spellStart"/>
+      <w:proofErr w:type="gramStart"/>
+      <w:r>
+        <w:t>zeile,spalte</w:t>
+      </w:r>
+      <w:proofErr w:type="spellEnd"/>
+      <w:proofErr w:type="gramEnd"/>
+      <w:r>
+        <w:t>". Der Controller liest diese Information aus und weiß dadurch genau, welches Feld angeklickt wurde.</w:t>
+      </w:r>
+    </w:p>
+    <w:p>
+      <w:pPr>
+        <w:numPr>
+          <w:ilvl w:val="0"/>
+          <w:numId w:val="9"/>
+        </w:numPr>
+      </w:pPr>
+      <w:r>
+        <w:t xml:space="preserve">Weitergabe an die Spiellogik: Der Controller ruft </w:t>
+      </w:r>
+      <w:proofErr w:type="spellStart"/>
+      <w:proofErr w:type="gramStart"/>
+      <w:r>
+        <w:t>zugAusfuehren</w:t>
+      </w:r>
+      <w:proofErr w:type="spellEnd"/>
+      <w:r>
+        <w:t>(</w:t>
+      </w:r>
+      <w:proofErr w:type="gramEnd"/>
+      <w:r>
+        <w:t>) auf und überlässt der Logik die Entscheidung, ob der Zug gültig ist.</w:t>
+      </w:r>
+    </w:p>
+    <w:p>
+      <w:pPr>
+        <w:numPr>
+          <w:ilvl w:val="0"/>
+          <w:numId w:val="9"/>
+        </w:numPr>
+      </w:pPr>
+      <w:r>
+        <w:t xml:space="preserve">Aktualisierung der GUI: Nach einem gültigen Zug wird der entsprechende Button im </w:t>
+      </w:r>
+      <w:proofErr w:type="spellStart"/>
+      <w:r>
+        <w:t>GameBoard</w:t>
+      </w:r>
+      <w:proofErr w:type="spellEnd"/>
+      <w:r>
+        <w:t xml:space="preserve"> aktualisiert (Symbol + Farbe + Deaktivierung).</w:t>
+      </w:r>
+    </w:p>
+    <w:p>
+      <w:pPr>
+        <w:numPr>
+          <w:ilvl w:val="0"/>
+          <w:numId w:val="9"/>
+        </w:numPr>
+      </w:pPr>
+      <w:r>
+        <w:t>Spielende erkennen: Der Controller prüft über die Logik, ob das Spiel vorbei ist:</w:t>
+      </w:r>
+    </w:p>
+    <w:p>
+      <w:pPr>
+        <w:numPr>
+          <w:ilvl w:val="1"/>
+          <w:numId w:val="9"/>
+        </w:numPr>
+      </w:pPr>
+      <w:r>
+        <w:t>Bei einem Sieg wird der Gewinner an das Hauptfenster gemeldet.</w:t>
+      </w:r>
+    </w:p>
+    <w:p>
+      <w:pPr>
+        <w:numPr>
+          <w:ilvl w:val="1"/>
+          <w:numId w:val="9"/>
+        </w:numPr>
+      </w:pPr>
+      <w:r>
+        <w:t>Bei einem Unentschieden wird ebenfalls eine Meldung ausgegeben.</w:t>
+      </w:r>
+    </w:p>
+    <w:p>
+      <w:pPr>
+        <w:numPr>
+          <w:ilvl w:val="1"/>
+          <w:numId w:val="9"/>
+        </w:numPr>
+      </w:pPr>
+      <w:r>
+        <w:lastRenderedPageBreak/>
+        <w:t>Alle Buttons werden deaktiviert, um weitere Eingaben zu verhindern.</w:t>
+      </w:r>
+    </w:p>
+    <w:p>
+      <w:pPr>
+        <w:numPr>
+          <w:ilvl w:val="0"/>
+          <w:numId w:val="9"/>
+        </w:numPr>
+      </w:pPr>
+      <w:r>
+        <w:t>Statusanzeige aktualisieren: Wenn das Spiel weiterläuft, wird im Hauptfenster angezeigt, welcher Spieler als Nächstes am Zug ist.</w:t>
+      </w:r>
+    </w:p>
+    <w:p/>
+    <w:p>
       <w:pPr>
         <w:pStyle w:val="berschrift2"/>
       </w:pPr>
@@ -7383,45 +7812,242 @@
         <w:spacing w:before="60" w:after="120"/>
       </w:pPr>
       <w:r>
+        <w:t>Das Fenster ist auf 480×580 Pixel fixiert (</w:t>
+      </w:r>
+      <w:proofErr w:type="spellStart"/>
+      <w:r>
+        <w:t>setResizable</w:t>
+      </w:r>
+      <w:proofErr w:type="spellEnd"/>
+      <w:r>
+        <w:t>(</w:t>
+      </w:r>
+      <w:proofErr w:type="spellStart"/>
+      <w:r>
+        <w:t>false</w:t>
+      </w:r>
+      <w:proofErr w:type="spellEnd"/>
+      <w:r>
+        <w:t>)) und wird beim Start auf dem Bildschirm zentriert (</w:t>
+      </w:r>
+      <w:proofErr w:type="spellStart"/>
+      <w:r>
+        <w:t>setLocationRelativeTo</w:t>
+      </w:r>
+      <w:proofErr w:type="spellEnd"/>
+      <w:r>
+        <w:t>(null)).</w:t>
+      </w:r>
+    </w:p>
+    <w:p/>
+    <w:p>
+      <w:r>
+        <w:drawing>
+          <wp:inline distT="0" distB="0" distL="0" distR="0" wp14:anchorId="77B7540B" wp14:editId="6A5DBF6D">
+            <wp:extent cx="5943600" cy="2274570"/>
+            <wp:effectExtent l="0" t="0" r="0" b="0"/>
+            <wp:docPr id="899599959" name="Grafik 1"/>
+            <wp:cNvGraphicFramePr>
+              <a:graphicFrameLocks xmlns:a="http://schemas.openxmlformats.org/drawingml/2006/main" noChangeAspect="1"/>
+            </wp:cNvGraphicFramePr>
+            <a:graphic xmlns:a="http://schemas.openxmlformats.org/drawingml/2006/main">
+              <a:graphicData uri="http://schemas.openxmlformats.org/drawingml/2006/picture">
+                <pic:pic xmlns:pic="http://schemas.openxmlformats.org/drawingml/2006/picture">
+                  <pic:nvPicPr>
+                    <pic:cNvPr id="899599959" name=""/>
+                    <pic:cNvPicPr/>
+                  </pic:nvPicPr>
+                  <pic:blipFill>
+                    <a:blip r:embed="rId12"/>
+                    <a:stretch>
+                      <a:fillRect/>
+                    </a:stretch>
+                  </pic:blipFill>
+                  <pic:spPr>
+                    <a:xfrm>
+                      <a:off x="0" y="0"/>
+                      <a:ext cx="5943600" cy="2274570"/>
+                    </a:xfrm>
+                    <a:prstGeom prst="rect">
+                      <a:avLst/>
+                    </a:prstGeom>
+                  </pic:spPr>
+                </pic:pic>
+              </a:graphicData>
+            </a:graphic>
+          </wp:inline>
+        </w:drawing>
+      </w:r>
+    </w:p>
+    <w:p>
+      <w:pPr>
+        <w:rPr>
+          <w:b/>
+          <w:bCs/>
+        </w:rPr>
+      </w:pPr>
+      <w:r>
+        <w:rPr>
+          <w:b/>
+          <w:bCs/>
+        </w:rPr>
+        <w:t xml:space="preserve">Aufgaben der Methode </w:t>
+      </w:r>
+      <w:proofErr w:type="spellStart"/>
+      <w:proofErr w:type="gramStart"/>
+      <w:r>
+        <w:rPr>
+          <w:b/>
+          <w:bCs/>
+        </w:rPr>
+        <w:t>zeigeSpielEnde</w:t>
+      </w:r>
+      <w:proofErr w:type="spellEnd"/>
+      <w:r>
+        <w:rPr>
+          <w:b/>
+          <w:bCs/>
+        </w:rPr>
+        <w:t>(</w:t>
+      </w:r>
+      <w:proofErr w:type="gramEnd"/>
+      <w:r>
+        <w:rPr>
+          <w:b/>
+          <w:bCs/>
+        </w:rPr>
+        <w:t>)</w:t>
+      </w:r>
+    </w:p>
+    <w:p>
+      <w:pPr>
+        <w:numPr>
+          <w:ilvl w:val="0"/>
+          <w:numId w:val="10"/>
+        </w:numPr>
+      </w:pPr>
+      <w:r>
+        <w:t>Erkennen des Spielausgangs: Die Methode erhält vom Controller entweder den Gewinner oder null bei einem Unentschieden.</w:t>
+      </w:r>
+    </w:p>
+    <w:p>
+      <w:pPr>
+        <w:numPr>
+          <w:ilvl w:val="0"/>
+          <w:numId w:val="10"/>
+        </w:numPr>
+      </w:pPr>
+      <w:r>
+        <w:t>Aktualisierung der Statusleiste: Der Statustext wird sofort angepasst:</w:t>
+      </w:r>
+    </w:p>
+    <w:p>
+      <w:pPr>
+        <w:numPr>
+          <w:ilvl w:val="1"/>
+          <w:numId w:val="10"/>
+        </w:numPr>
+      </w:pPr>
+      <w:r>
+        <w:t>Bei einem Sieg wird der Gewinner farblich hervorgehoben.</w:t>
+      </w:r>
+    </w:p>
+    <w:p>
+      <w:pPr>
+        <w:numPr>
+          <w:ilvl w:val="1"/>
+          <w:numId w:val="10"/>
+        </w:numPr>
+      </w:pPr>
+      <w:r>
+        <w:t>Bei einem Unentschieden wird ein neutraler Text angezeigt.</w:t>
+      </w:r>
+    </w:p>
+    <w:p>
+      <w:pPr>
+        <w:numPr>
+          <w:ilvl w:val="0"/>
+          <w:numId w:val="10"/>
+        </w:numPr>
+      </w:pPr>
+      <w:r>
+        <w:t xml:space="preserve">Anzeige eines Dialogfensters: Ein </w:t>
+      </w:r>
+      <w:proofErr w:type="spellStart"/>
+      <w:r>
+        <w:t>JOptionPane</w:t>
+      </w:r>
+      <w:proofErr w:type="spellEnd"/>
+      <w:r>
+        <w:t xml:space="preserve"> informiert den Spieler über das Ergebnis und bietet direkt die Möglichkeit, ein neues Spiel zu starten.</w:t>
+      </w:r>
+    </w:p>
+    <w:p>
+      <w:pPr>
+        <w:numPr>
+          <w:ilvl w:val="0"/>
+          <w:numId w:val="10"/>
+        </w:numPr>
+      </w:pPr>
+      <w:r>
+        <w:t>Neustart des Spiels: Wenn der Benutzer „Ja“ wählt, wird über den Controller ein vollständiger Neustart ausgelöst:</w:t>
+      </w:r>
+    </w:p>
+    <w:p>
+      <w:pPr>
+        <w:numPr>
+          <w:ilvl w:val="1"/>
+          <w:numId w:val="10"/>
+        </w:numPr>
+      </w:pPr>
+      <w:r>
+        <w:t>Spiellogik wird zurückgesetzt</w:t>
+      </w:r>
+    </w:p>
+    <w:p>
+      <w:pPr>
+        <w:numPr>
+          <w:ilvl w:val="1"/>
+          <w:numId w:val="10"/>
+        </w:numPr>
+      </w:pPr>
+      <w:r>
+        <w:t>Spielfeld wird geleert</w:t>
+      </w:r>
+    </w:p>
+    <w:p>
+      <w:pPr>
+        <w:numPr>
+          <w:ilvl w:val="1"/>
+          <w:numId w:val="10"/>
+        </w:numPr>
+      </w:pPr>
+      <w:r>
+        <w:t>Statusanzeige wird aktualisiert</w:t>
+      </w:r>
+    </w:p>
+    <w:p/>
+    <w:p>
+      <w:pPr>
+        <w:rPr>
+          <w:b/>
+          <w:bCs/>
+          <w:color w:val="1E40AF"/>
+          <w:sz w:val="36"/>
+          <w:szCs w:val="36"/>
+        </w:rPr>
+      </w:pPr>
+      <w:bookmarkStart w:id="17" w:name="_Toc228612548"/>
+      <w:r>
+        <w:br w:type="page"/>
+      </w:r>
+    </w:p>
+    <w:p>
+      <w:pPr>
+        <w:pStyle w:val="berschrift1"/>
+      </w:pPr>
+      <w:r>
         <w:lastRenderedPageBreak/>
-        <w:t>Das Fenster ist auf 480×580 Pixel fixiert (</w:t>
-      </w:r>
-      <w:proofErr w:type="spellStart"/>
-      <w:r>
-        <w:t>setResizable</w:t>
-      </w:r>
-      <w:proofErr w:type="spellEnd"/>
-      <w:r>
-        <w:t>(</w:t>
-      </w:r>
-      <w:proofErr w:type="spellStart"/>
-      <w:r>
-        <w:t>false</w:t>
-      </w:r>
-      <w:proofErr w:type="spellEnd"/>
-      <w:r>
-        <w:t>)) und wird beim Start auf dem Bildschirm zentriert (</w:t>
-      </w:r>
-      <w:proofErr w:type="spellStart"/>
-      <w:r>
-        <w:t>setLocationRelativeTo</w:t>
-      </w:r>
-      <w:proofErr w:type="spellEnd"/>
-      <w:r>
-        <w:t>(null)).</w:t>
-      </w:r>
-    </w:p>
-    <w:p>
-      <w:r>
-        <w:br/>
-      </w:r>
-    </w:p>
-    <w:p>
-      <w:pPr>
-        <w:pStyle w:val="berschrift1"/>
-      </w:pPr>
-      <w:bookmarkStart w:id="17" w:name="_Toc228612548"/>
-      <w:r>
         <w:t>5. Spielablauf</w:t>
       </w:r>
       <w:bookmarkEnd w:id="17"/>
@@ -7839,7 +8465,6 @@
       </w:pPr>
       <w:bookmarkStart w:id="23" w:name="_Toc228612554"/>
       <w:r>
-        <w:lastRenderedPageBreak/>
         <w:t>6.1 Voraussetzungen</w:t>
       </w:r>
       <w:bookmarkEnd w:id="23"/>
@@ -7898,6 +8523,7 @@
       </w:pPr>
       <w:bookmarkStart w:id="24" w:name="_Toc228612555"/>
       <w:r>
+        <w:lastRenderedPageBreak/>
         <w:t>6.2 Terminal-Befehle</w:t>
       </w:r>
       <w:bookmarkEnd w:id="24"/>
@@ -8141,12 +8767,6 @@
         <w:gridCol w:w="9360"/>
       </w:tblGrid>
       <w:tr>
-        <w:tblPrEx>
-          <w:tblCellMar>
-            <w:top w:w="0" w:type="dxa"/>
-            <w:bottom w:w="0" w:type="dxa"/>
-          </w:tblCellMar>
-        </w:tblPrEx>
         <w:tc>
           <w:tcPr>
             <w:tcW w:w="9360" w:type="dxa"/>
@@ -8177,12 +8797,6 @@
         </w:tc>
       </w:tr>
       <w:tr>
-        <w:tblPrEx>
-          <w:tblCellMar>
-            <w:top w:w="0" w:type="dxa"/>
-            <w:bottom w:w="0" w:type="dxa"/>
-          </w:tblCellMar>
-        </w:tblPrEx>
         <w:tc>
           <w:tcPr>
             <w:tcW w:w="9360" w:type="dxa"/>
@@ -8211,12 +8825,6 @@
         </w:tc>
       </w:tr>
       <w:tr>
-        <w:tblPrEx>
-          <w:tblCellMar>
-            <w:top w:w="0" w:type="dxa"/>
-            <w:bottom w:w="0" w:type="dxa"/>
-          </w:tblCellMar>
-        </w:tblPrEx>
         <w:tc>
           <w:tcPr>
             <w:tcW w:w="9360" w:type="dxa"/>
@@ -8245,12 +8853,6 @@
         </w:tc>
       </w:tr>
       <w:tr>
-        <w:tblPrEx>
-          <w:tblCellMar>
-            <w:top w:w="0" w:type="dxa"/>
-            <w:bottom w:w="0" w:type="dxa"/>
-          </w:tblCellMar>
-        </w:tblPrEx>
         <w:tc>
           <w:tcPr>
             <w:tcW w:w="9360" w:type="dxa"/>
@@ -8376,12 +8978,6 @@
         <w:gridCol w:w="3160"/>
       </w:tblGrid>
       <w:tr>
-        <w:tblPrEx>
-          <w:tblCellMar>
-            <w:top w:w="0" w:type="dxa"/>
-            <w:bottom w:w="0" w:type="dxa"/>
-          </w:tblCellMar>
-        </w:tblPrEx>
         <w:trPr>
           <w:tblHeader/>
         </w:trPr>
@@ -8477,12 +9073,6 @@
         </w:tc>
       </w:tr>
       <w:tr>
-        <w:tblPrEx>
-          <w:tblCellMar>
-            <w:top w:w="0" w:type="dxa"/>
-            <w:bottom w:w="0" w:type="dxa"/>
-          </w:tblCellMar>
-        </w:tblPrEx>
         <w:tc>
           <w:tcPr>
             <w:tcW w:w="3400" w:type="dxa"/>
@@ -8589,12 +9179,6 @@
         </w:tc>
       </w:tr>
       <w:tr>
-        <w:tblPrEx>
-          <w:tblCellMar>
-            <w:top w:w="0" w:type="dxa"/>
-            <w:bottom w:w="0" w:type="dxa"/>
-          </w:tblCellMar>
-        </w:tblPrEx>
         <w:tc>
           <w:tcPr>
             <w:tcW w:w="3400" w:type="dxa"/>
@@ -8701,12 +9285,6 @@
         </w:tc>
       </w:tr>
       <w:tr>
-        <w:tblPrEx>
-          <w:tblCellMar>
-            <w:top w:w="0" w:type="dxa"/>
-            <w:bottom w:w="0" w:type="dxa"/>
-          </w:tblCellMar>
-        </w:tblPrEx>
         <w:tc>
           <w:tcPr>
             <w:tcW w:w="3400" w:type="dxa"/>
@@ -8803,12 +9381,6 @@
         </w:tc>
       </w:tr>
       <w:tr>
-        <w:tblPrEx>
-          <w:tblCellMar>
-            <w:top w:w="0" w:type="dxa"/>
-            <w:bottom w:w="0" w:type="dxa"/>
-          </w:tblCellMar>
-        </w:tblPrEx>
         <w:tc>
           <w:tcPr>
             <w:tcW w:w="3400" w:type="dxa"/>
@@ -8833,7 +9405,6 @@
                 <w:sz w:val="20"/>
                 <w:szCs w:val="20"/>
               </w:rPr>
-              <w:lastRenderedPageBreak/>
               <w:t>Einstellungen (Spielfeldgröße 4×4)</w:t>
             </w:r>
           </w:p>
@@ -8916,12 +9487,6 @@
         </w:tc>
       </w:tr>
       <w:tr>
-        <w:tblPrEx>
-          <w:tblCellMar>
-            <w:top w:w="0" w:type="dxa"/>
-            <w:bottom w:w="0" w:type="dxa"/>
-          </w:tblCellMar>
-        </w:tblPrEx>
         <w:tc>
           <w:tcPr>
             <w:tcW w:w="3400" w:type="dxa"/>
@@ -9018,12 +9583,6 @@
         </w:tc>
       </w:tr>
       <w:tr>
-        <w:tblPrEx>
-          <w:tblCellMar>
-            <w:top w:w="0" w:type="dxa"/>
-            <w:bottom w:w="0" w:type="dxa"/>
-          </w:tblCellMar>
-        </w:tblPrEx>
         <w:tc>
           <w:tcPr>
             <w:tcW w:w="3400" w:type="dxa"/>
@@ -9119,6 +9678,7 @@
       </w:pPr>
       <w:bookmarkStart w:id="27" w:name="_Toc228612558"/>
       <w:r>
+        <w:lastRenderedPageBreak/>
         <w:t>7.1 KI-Implementierung (Skizze)</w:t>
       </w:r>
       <w:bookmarkEnd w:id="27"/>
@@ -10300,12 +10860,6 @@
         <w:gridCol w:w="6360"/>
       </w:tblGrid>
       <w:tr>
-        <w:tblPrEx>
-          <w:tblCellMar>
-            <w:top w:w="0" w:type="dxa"/>
-            <w:bottom w:w="0" w:type="dxa"/>
-          </w:tblCellMar>
-        </w:tblPrEx>
         <w:trPr>
           <w:tblHeader/>
         </w:trPr>
@@ -10371,12 +10925,6 @@
         </w:tc>
       </w:tr>
       <w:tr>
-        <w:tblPrEx>
-          <w:tblCellMar>
-            <w:top w:w="0" w:type="dxa"/>
-            <w:bottom w:w="0" w:type="dxa"/>
-          </w:tblCellMar>
-        </w:tblPrEx>
         <w:tc>
           <w:tcPr>
             <w:tcW w:w="3000" w:type="dxa"/>
@@ -10445,12 +10993,6 @@
         </w:tc>
       </w:tr>
       <w:tr>
-        <w:tblPrEx>
-          <w:tblCellMar>
-            <w:top w:w="0" w:type="dxa"/>
-            <w:bottom w:w="0" w:type="dxa"/>
-          </w:tblCellMar>
-        </w:tblPrEx>
         <w:tc>
           <w:tcPr>
             <w:tcW w:w="3000" w:type="dxa"/>
@@ -10565,12 +11107,6 @@
         </w:tc>
       </w:tr>
       <w:tr>
-        <w:tblPrEx>
-          <w:tblCellMar>
-            <w:top w:w="0" w:type="dxa"/>
-            <w:bottom w:w="0" w:type="dxa"/>
-          </w:tblCellMar>
-        </w:tblPrEx>
         <w:tc>
           <w:tcPr>
             <w:tcW w:w="3000" w:type="dxa"/>
@@ -10595,6 +11131,7 @@
                 <w:sz w:val="20"/>
                 <w:szCs w:val="20"/>
               </w:rPr>
+              <w:lastRenderedPageBreak/>
               <w:t>Kapselung</w:t>
             </w:r>
           </w:p>
@@ -10629,12 +11166,6 @@
         </w:tc>
       </w:tr>
       <w:tr>
-        <w:tblPrEx>
-          <w:tblCellMar>
-            <w:top w:w="0" w:type="dxa"/>
-            <w:bottom w:w="0" w:type="dxa"/>
-          </w:tblCellMar>
-        </w:tblPrEx>
         <w:tc>
           <w:tcPr>
             <w:tcW w:w="3000" w:type="dxa"/>
@@ -10750,12 +11281,6 @@
         <w:gridCol w:w="5360"/>
       </w:tblGrid>
       <w:tr>
-        <w:tblPrEx>
-          <w:tblCellMar>
-            <w:top w:w="0" w:type="dxa"/>
-            <w:bottom w:w="0" w:type="dxa"/>
-          </w:tblCellMar>
-        </w:tblPrEx>
         <w:trPr>
           <w:tblHeader/>
         </w:trPr>
@@ -10851,12 +11376,6 @@
         </w:tc>
       </w:tr>
       <w:tr>
-        <w:tblPrEx>
-          <w:tblCellMar>
-            <w:top w:w="0" w:type="dxa"/>
-            <w:bottom w:w="0" w:type="dxa"/>
-          </w:tblCellMar>
-        </w:tblPrEx>
         <w:tc>
           <w:tcPr>
             <w:tcW w:w="2400" w:type="dxa"/>
@@ -10973,12 +11492,6 @@
         </w:tc>
       </w:tr>
       <w:tr>
-        <w:tblPrEx>
-          <w:tblCellMar>
-            <w:top w:w="0" w:type="dxa"/>
-            <w:bottom w:w="0" w:type="dxa"/>
-          </w:tblCellMar>
-        </w:tblPrEx>
         <w:tc>
           <w:tcPr>
             <w:tcW w:w="2400" w:type="dxa"/>
@@ -11131,12 +11644,6 @@
         </w:tc>
       </w:tr>
       <w:tr>
-        <w:tblPrEx>
-          <w:tblCellMar>
-            <w:top w:w="0" w:type="dxa"/>
-            <w:bottom w:w="0" w:type="dxa"/>
-          </w:tblCellMar>
-        </w:tblPrEx>
         <w:tc>
           <w:tcPr>
             <w:tcW w:w="2400" w:type="dxa"/>
@@ -11299,12 +11806,6 @@
         </w:tc>
       </w:tr>
       <w:tr>
-        <w:tblPrEx>
-          <w:tblCellMar>
-            <w:top w:w="0" w:type="dxa"/>
-            <w:bottom w:w="0" w:type="dxa"/>
-          </w:tblCellMar>
-        </w:tblPrEx>
         <w:tc>
           <w:tcPr>
             <w:tcW w:w="2400" w:type="dxa"/>
@@ -11429,12 +11930,6 @@
         </w:tc>
       </w:tr>
       <w:tr>
-        <w:tblPrEx>
-          <w:tblCellMar>
-            <w:top w:w="0" w:type="dxa"/>
-            <w:bottom w:w="0" w:type="dxa"/>
-          </w:tblCellMar>
-        </w:tblPrEx>
         <w:tc>
           <w:tcPr>
             <w:tcW w:w="2400" w:type="dxa"/>
@@ -11569,12 +12064,6 @@
         </w:tc>
       </w:tr>
       <w:tr>
-        <w:tblPrEx>
-          <w:tblCellMar>
-            <w:top w:w="0" w:type="dxa"/>
-            <w:bottom w:w="0" w:type="dxa"/>
-          </w:tblCellMar>
-        </w:tblPrEx>
         <w:tc>
           <w:tcPr>
             <w:tcW w:w="2400" w:type="dxa"/>
@@ -11762,8 +12251,8 @@
       </w:r>
     </w:p>
     <w:sectPr>
-      <w:headerReference w:type="default" r:id="rId8"/>
-      <w:footerReference w:type="default" r:id="rId9"/>
+      <w:headerReference w:type="default" r:id="rId13"/>
+      <w:footerReference w:type="default" r:id="rId14"/>
       <w:pgSz w:w="12240" w:h="15840"/>
       <w:pgMar w:top="1440" w:right="1440" w:bottom="1440" w:left="1440" w:header="708" w:footer="708" w:gutter="0"/>
       <w:cols w:space="720"/>
@@ -11957,6 +12446,751 @@
 <file path=word/numbering.xml><?xml version="1.0" encoding="utf-8"?>
 <w:numbering xmlns:wpc="http://schemas.microsoft.com/office/word/2010/wordprocessingCanvas" xmlns:cx="http://schemas.microsoft.com/office/drawing/2014/chartex" xmlns:cx1="http://schemas.microsoft.com/office/drawing/2015/9/8/chartex" xmlns:cx2="http://schemas.microsoft.com/office/drawing/2015/10/21/chartex" xmlns:cx3="http://schemas.microsoft.com/office/drawing/2016/5/9/chartex" xmlns:cx4="http://schemas.microsoft.com/office/drawing/2016/5/10/chartex" xmlns:cx5="http://schemas.microsoft.com/office/drawing/2016/5/11/chartex" xmlns:cx6="http://schemas.microsoft.com/office/drawing/2016/5/12/chartex" xmlns:cx7="http://schemas.microsoft.com/office/drawing/2016/5/13/chartex" xmlns:cx8="http://schemas.microsoft.com/office/drawing/2016/5/14/chartex" xmlns:mc="http://schemas.openxmlformats.org/markup-compatibility/2006" xmlns:aink="http://schemas.microsoft.com/office/drawing/2016/ink" xmlns:am3d="http://schemas.microsoft.com/office/drawing/2017/model3d" xmlns:o="urn:schemas-microsoft-com:office:office" xmlns:oel="http://schemas.microsoft.com/office/2019/extlst" xmlns:r="http://schemas.openxmlformats.org/officeDocument/2006/relationships" xmlns:m="http://schemas.openxmlformats.org/officeDocument/2006/math" xmlns:v="urn:schemas-microsoft-com:vml" xmlns:wp14="http://schemas.microsoft.com/office/word/2010/wordprocessingDrawing" xmlns:wp="http://schemas.openxmlformats.org/drawingml/2006/wordprocessingDrawing" xmlns:w10="urn:schemas-microsoft-com:office:word" xmlns:w="http://schemas.openxmlformats.org/wordprocessingml/2006/main" xmlns:w14="http://schemas.microsoft.com/office/word/2010/wordml" xmlns:w15="http://schemas.microsoft.com/office/word/2012/wordml" xmlns:w16cex="http://schemas.microsoft.com/office/word/2018/wordml/cex" xmlns:w16cid="http://schemas.microsoft.com/office/word/2016/wordml/cid" xmlns:w16="http://schemas.microsoft.com/office/word/2018/wordml" xmlns:w16du="http://schemas.microsoft.com/office/word/2023/wordml/word16du" xmlns:w16sdtdh="http://schemas.microsoft.com/office/word/2020/wordml/sdtdatahash" xmlns:w16sdtfl="http://schemas.microsoft.com/office/word/2024/wordml/sdtformatlock" xmlns:w16se="http://schemas.microsoft.com/office/word/2015/wordml/symex" xmlns:wpg="http://schemas.microsoft.com/office/word/2010/wordprocessingGroup" xmlns:wpi="http://schemas.microsoft.com/office/word/2010/wordprocessingInk" xmlns:wne="http://schemas.microsoft.com/office/word/2006/wordml" xmlns:wps="http://schemas.microsoft.com/office/word/2010/wordprocessingShape" mc:Ignorable="w14 w15 w16se w16cid w16 w16cex w16sdtdh w16sdtfl w16du wp14">
   <w:abstractNum w:abstractNumId="0" w15:restartNumberingAfterBreak="0">
+    <w:nsid w:val="03655CBB"/>
+    <w:multiLevelType w:val="multilevel"/>
+    <w:tmpl w:val="58368CD8"/>
+    <w:lvl w:ilvl="0">
+      <w:start w:val="1"/>
+      <w:numFmt w:val="bullet"/>
+      <w:lvlText w:val=""/>
+      <w:lvlJc w:val="left"/>
+      <w:pPr>
+        <w:tabs>
+          <w:tab w:val="num" w:pos="720"/>
+        </w:tabs>
+        <w:ind w:left="720" w:hanging="360"/>
+      </w:pPr>
+      <w:rPr>
+        <w:rFonts w:ascii="Symbol" w:hAnsi="Symbol" w:hint="default"/>
+        <w:sz w:val="20"/>
+      </w:rPr>
+    </w:lvl>
+    <w:lvl w:ilvl="1" w:tentative="1">
+      <w:start w:val="1"/>
+      <w:numFmt w:val="bullet"/>
+      <w:lvlText w:val="o"/>
+      <w:lvlJc w:val="left"/>
+      <w:pPr>
+        <w:tabs>
+          <w:tab w:val="num" w:pos="1440"/>
+        </w:tabs>
+        <w:ind w:left="1440" w:hanging="360"/>
+      </w:pPr>
+      <w:rPr>
+        <w:rFonts w:ascii="Courier New" w:hAnsi="Courier New" w:hint="default"/>
+        <w:sz w:val="20"/>
+      </w:rPr>
+    </w:lvl>
+    <w:lvl w:ilvl="2" w:tentative="1">
+      <w:start w:val="1"/>
+      <w:numFmt w:val="bullet"/>
+      <w:lvlText w:val=""/>
+      <w:lvlJc w:val="left"/>
+      <w:pPr>
+        <w:tabs>
+          <w:tab w:val="num" w:pos="2160"/>
+        </w:tabs>
+        <w:ind w:left="2160" w:hanging="360"/>
+      </w:pPr>
+      <w:rPr>
+        <w:rFonts w:ascii="Wingdings" w:hAnsi="Wingdings" w:hint="default"/>
+        <w:sz w:val="20"/>
+      </w:rPr>
+    </w:lvl>
+    <w:lvl w:ilvl="3" w:tentative="1">
+      <w:start w:val="1"/>
+      <w:numFmt w:val="bullet"/>
+      <w:lvlText w:val=""/>
+      <w:lvlJc w:val="left"/>
+      <w:pPr>
+        <w:tabs>
+          <w:tab w:val="num" w:pos="2880"/>
+        </w:tabs>
+        <w:ind w:left="2880" w:hanging="360"/>
+      </w:pPr>
+      <w:rPr>
+        <w:rFonts w:ascii="Wingdings" w:hAnsi="Wingdings" w:hint="default"/>
+        <w:sz w:val="20"/>
+      </w:rPr>
+    </w:lvl>
+    <w:lvl w:ilvl="4" w:tentative="1">
+      <w:start w:val="1"/>
+      <w:numFmt w:val="bullet"/>
+      <w:lvlText w:val=""/>
+      <w:lvlJc w:val="left"/>
+      <w:pPr>
+        <w:tabs>
+          <w:tab w:val="num" w:pos="3600"/>
+        </w:tabs>
+        <w:ind w:left="3600" w:hanging="360"/>
+      </w:pPr>
+      <w:rPr>
+        <w:rFonts w:ascii="Wingdings" w:hAnsi="Wingdings" w:hint="default"/>
+        <w:sz w:val="20"/>
+      </w:rPr>
+    </w:lvl>
+    <w:lvl w:ilvl="5" w:tentative="1">
+      <w:start w:val="1"/>
+      <w:numFmt w:val="bullet"/>
+      <w:lvlText w:val=""/>
+      <w:lvlJc w:val="left"/>
+      <w:pPr>
+        <w:tabs>
+          <w:tab w:val="num" w:pos="4320"/>
+        </w:tabs>
+        <w:ind w:left="4320" w:hanging="360"/>
+      </w:pPr>
+      <w:rPr>
+        <w:rFonts w:ascii="Wingdings" w:hAnsi="Wingdings" w:hint="default"/>
+        <w:sz w:val="20"/>
+      </w:rPr>
+    </w:lvl>
+    <w:lvl w:ilvl="6" w:tentative="1">
+      <w:start w:val="1"/>
+      <w:numFmt w:val="bullet"/>
+      <w:lvlText w:val=""/>
+      <w:lvlJc w:val="left"/>
+      <w:pPr>
+        <w:tabs>
+          <w:tab w:val="num" w:pos="5040"/>
+        </w:tabs>
+        <w:ind w:left="5040" w:hanging="360"/>
+      </w:pPr>
+      <w:rPr>
+        <w:rFonts w:ascii="Wingdings" w:hAnsi="Wingdings" w:hint="default"/>
+        <w:sz w:val="20"/>
+      </w:rPr>
+    </w:lvl>
+    <w:lvl w:ilvl="7" w:tentative="1">
+      <w:start w:val="1"/>
+      <w:numFmt w:val="bullet"/>
+      <w:lvlText w:val=""/>
+      <w:lvlJc w:val="left"/>
+      <w:pPr>
+        <w:tabs>
+          <w:tab w:val="num" w:pos="5760"/>
+        </w:tabs>
+        <w:ind w:left="5760" w:hanging="360"/>
+      </w:pPr>
+      <w:rPr>
+        <w:rFonts w:ascii="Wingdings" w:hAnsi="Wingdings" w:hint="default"/>
+        <w:sz w:val="20"/>
+      </w:rPr>
+    </w:lvl>
+    <w:lvl w:ilvl="8" w:tentative="1">
+      <w:start w:val="1"/>
+      <w:numFmt w:val="bullet"/>
+      <w:lvlText w:val=""/>
+      <w:lvlJc w:val="left"/>
+      <w:pPr>
+        <w:tabs>
+          <w:tab w:val="num" w:pos="6480"/>
+        </w:tabs>
+        <w:ind w:left="6480" w:hanging="360"/>
+      </w:pPr>
+      <w:rPr>
+        <w:rFonts w:ascii="Wingdings" w:hAnsi="Wingdings" w:hint="default"/>
+        <w:sz w:val="20"/>
+      </w:rPr>
+    </w:lvl>
+  </w:abstractNum>
+  <w:abstractNum w:abstractNumId="1" w15:restartNumberingAfterBreak="0">
+    <w:nsid w:val="0FEB4DC3"/>
+    <w:multiLevelType w:val="multilevel"/>
+    <w:tmpl w:val="11A6801C"/>
+    <w:lvl w:ilvl="0">
+      <w:start w:val="1"/>
+      <w:numFmt w:val="bullet"/>
+      <w:lvlText w:val=""/>
+      <w:lvlJc w:val="left"/>
+      <w:pPr>
+        <w:tabs>
+          <w:tab w:val="num" w:pos="720"/>
+        </w:tabs>
+        <w:ind w:left="720" w:hanging="360"/>
+      </w:pPr>
+      <w:rPr>
+        <w:rFonts w:ascii="Symbol" w:hAnsi="Symbol" w:hint="default"/>
+        <w:sz w:val="20"/>
+      </w:rPr>
+    </w:lvl>
+    <w:lvl w:ilvl="1">
+      <w:start w:val="1"/>
+      <w:numFmt w:val="bullet"/>
+      <w:lvlText w:val="o"/>
+      <w:lvlJc w:val="left"/>
+      <w:pPr>
+        <w:tabs>
+          <w:tab w:val="num" w:pos="1440"/>
+        </w:tabs>
+        <w:ind w:left="1440" w:hanging="360"/>
+      </w:pPr>
+      <w:rPr>
+        <w:rFonts w:ascii="Courier New" w:hAnsi="Courier New" w:hint="default"/>
+        <w:sz w:val="20"/>
+      </w:rPr>
+    </w:lvl>
+    <w:lvl w:ilvl="2" w:tentative="1">
+      <w:start w:val="1"/>
+      <w:numFmt w:val="bullet"/>
+      <w:lvlText w:val=""/>
+      <w:lvlJc w:val="left"/>
+      <w:pPr>
+        <w:tabs>
+          <w:tab w:val="num" w:pos="2160"/>
+        </w:tabs>
+        <w:ind w:left="2160" w:hanging="360"/>
+      </w:pPr>
+      <w:rPr>
+        <w:rFonts w:ascii="Wingdings" w:hAnsi="Wingdings" w:hint="default"/>
+        <w:sz w:val="20"/>
+      </w:rPr>
+    </w:lvl>
+    <w:lvl w:ilvl="3" w:tentative="1">
+      <w:start w:val="1"/>
+      <w:numFmt w:val="bullet"/>
+      <w:lvlText w:val=""/>
+      <w:lvlJc w:val="left"/>
+      <w:pPr>
+        <w:tabs>
+          <w:tab w:val="num" w:pos="2880"/>
+        </w:tabs>
+        <w:ind w:left="2880" w:hanging="360"/>
+      </w:pPr>
+      <w:rPr>
+        <w:rFonts w:ascii="Wingdings" w:hAnsi="Wingdings" w:hint="default"/>
+        <w:sz w:val="20"/>
+      </w:rPr>
+    </w:lvl>
+    <w:lvl w:ilvl="4" w:tentative="1">
+      <w:start w:val="1"/>
+      <w:numFmt w:val="bullet"/>
+      <w:lvlText w:val=""/>
+      <w:lvlJc w:val="left"/>
+      <w:pPr>
+        <w:tabs>
+          <w:tab w:val="num" w:pos="3600"/>
+        </w:tabs>
+        <w:ind w:left="3600" w:hanging="360"/>
+      </w:pPr>
+      <w:rPr>
+        <w:rFonts w:ascii="Wingdings" w:hAnsi="Wingdings" w:hint="default"/>
+        <w:sz w:val="20"/>
+      </w:rPr>
+    </w:lvl>
+    <w:lvl w:ilvl="5" w:tentative="1">
+      <w:start w:val="1"/>
+      <w:numFmt w:val="bullet"/>
+      <w:lvlText w:val=""/>
+      <w:lvlJc w:val="left"/>
+      <w:pPr>
+        <w:tabs>
+          <w:tab w:val="num" w:pos="4320"/>
+        </w:tabs>
+        <w:ind w:left="4320" w:hanging="360"/>
+      </w:pPr>
+      <w:rPr>
+        <w:rFonts w:ascii="Wingdings" w:hAnsi="Wingdings" w:hint="default"/>
+        <w:sz w:val="20"/>
+      </w:rPr>
+    </w:lvl>
+    <w:lvl w:ilvl="6" w:tentative="1">
+      <w:start w:val="1"/>
+      <w:numFmt w:val="bullet"/>
+      <w:lvlText w:val=""/>
+      <w:lvlJc w:val="left"/>
+      <w:pPr>
+        <w:tabs>
+          <w:tab w:val="num" w:pos="5040"/>
+        </w:tabs>
+        <w:ind w:left="5040" w:hanging="360"/>
+      </w:pPr>
+      <w:rPr>
+        <w:rFonts w:ascii="Wingdings" w:hAnsi="Wingdings" w:hint="default"/>
+        <w:sz w:val="20"/>
+      </w:rPr>
+    </w:lvl>
+    <w:lvl w:ilvl="7" w:tentative="1">
+      <w:start w:val="1"/>
+      <w:numFmt w:val="bullet"/>
+      <w:lvlText w:val=""/>
+      <w:lvlJc w:val="left"/>
+      <w:pPr>
+        <w:tabs>
+          <w:tab w:val="num" w:pos="5760"/>
+        </w:tabs>
+        <w:ind w:left="5760" w:hanging="360"/>
+      </w:pPr>
+      <w:rPr>
+        <w:rFonts w:ascii="Wingdings" w:hAnsi="Wingdings" w:hint="default"/>
+        <w:sz w:val="20"/>
+      </w:rPr>
+    </w:lvl>
+    <w:lvl w:ilvl="8" w:tentative="1">
+      <w:start w:val="1"/>
+      <w:numFmt w:val="bullet"/>
+      <w:lvlText w:val=""/>
+      <w:lvlJc w:val="left"/>
+      <w:pPr>
+        <w:tabs>
+          <w:tab w:val="num" w:pos="6480"/>
+        </w:tabs>
+        <w:ind w:left="6480" w:hanging="360"/>
+      </w:pPr>
+      <w:rPr>
+        <w:rFonts w:ascii="Wingdings" w:hAnsi="Wingdings" w:hint="default"/>
+        <w:sz w:val="20"/>
+      </w:rPr>
+    </w:lvl>
+  </w:abstractNum>
+  <w:abstractNum w:abstractNumId="2" w15:restartNumberingAfterBreak="0">
+    <w:nsid w:val="21696643"/>
+    <w:multiLevelType w:val="multilevel"/>
+    <w:tmpl w:val="C2606EF6"/>
+    <w:lvl w:ilvl="0">
+      <w:start w:val="1"/>
+      <w:numFmt w:val="bullet"/>
+      <w:lvlText w:val=""/>
+      <w:lvlJc w:val="left"/>
+      <w:pPr>
+        <w:tabs>
+          <w:tab w:val="num" w:pos="720"/>
+        </w:tabs>
+        <w:ind w:left="720" w:hanging="360"/>
+      </w:pPr>
+      <w:rPr>
+        <w:rFonts w:ascii="Symbol" w:hAnsi="Symbol" w:hint="default"/>
+        <w:sz w:val="20"/>
+      </w:rPr>
+    </w:lvl>
+    <w:lvl w:ilvl="1">
+      <w:start w:val="1"/>
+      <w:numFmt w:val="bullet"/>
+      <w:lvlText w:val="o"/>
+      <w:lvlJc w:val="left"/>
+      <w:pPr>
+        <w:tabs>
+          <w:tab w:val="num" w:pos="1440"/>
+        </w:tabs>
+        <w:ind w:left="1440" w:hanging="360"/>
+      </w:pPr>
+      <w:rPr>
+        <w:rFonts w:ascii="Courier New" w:hAnsi="Courier New" w:hint="default"/>
+        <w:sz w:val="20"/>
+      </w:rPr>
+    </w:lvl>
+    <w:lvl w:ilvl="2" w:tentative="1">
+      <w:start w:val="1"/>
+      <w:numFmt w:val="bullet"/>
+      <w:lvlText w:val=""/>
+      <w:lvlJc w:val="left"/>
+      <w:pPr>
+        <w:tabs>
+          <w:tab w:val="num" w:pos="2160"/>
+        </w:tabs>
+        <w:ind w:left="2160" w:hanging="360"/>
+      </w:pPr>
+      <w:rPr>
+        <w:rFonts w:ascii="Wingdings" w:hAnsi="Wingdings" w:hint="default"/>
+        <w:sz w:val="20"/>
+      </w:rPr>
+    </w:lvl>
+    <w:lvl w:ilvl="3" w:tentative="1">
+      <w:start w:val="1"/>
+      <w:numFmt w:val="bullet"/>
+      <w:lvlText w:val=""/>
+      <w:lvlJc w:val="left"/>
+      <w:pPr>
+        <w:tabs>
+          <w:tab w:val="num" w:pos="2880"/>
+        </w:tabs>
+        <w:ind w:left="2880" w:hanging="360"/>
+      </w:pPr>
+      <w:rPr>
+        <w:rFonts w:ascii="Wingdings" w:hAnsi="Wingdings" w:hint="default"/>
+        <w:sz w:val="20"/>
+      </w:rPr>
+    </w:lvl>
+    <w:lvl w:ilvl="4" w:tentative="1">
+      <w:start w:val="1"/>
+      <w:numFmt w:val="bullet"/>
+      <w:lvlText w:val=""/>
+      <w:lvlJc w:val="left"/>
+      <w:pPr>
+        <w:tabs>
+          <w:tab w:val="num" w:pos="3600"/>
+        </w:tabs>
+        <w:ind w:left="3600" w:hanging="360"/>
+      </w:pPr>
+      <w:rPr>
+        <w:rFonts w:ascii="Wingdings" w:hAnsi="Wingdings" w:hint="default"/>
+        <w:sz w:val="20"/>
+      </w:rPr>
+    </w:lvl>
+    <w:lvl w:ilvl="5" w:tentative="1">
+      <w:start w:val="1"/>
+      <w:numFmt w:val="bullet"/>
+      <w:lvlText w:val=""/>
+      <w:lvlJc w:val="left"/>
+      <w:pPr>
+        <w:tabs>
+          <w:tab w:val="num" w:pos="4320"/>
+        </w:tabs>
+        <w:ind w:left="4320" w:hanging="360"/>
+      </w:pPr>
+      <w:rPr>
+        <w:rFonts w:ascii="Wingdings" w:hAnsi="Wingdings" w:hint="default"/>
+        <w:sz w:val="20"/>
+      </w:rPr>
+    </w:lvl>
+    <w:lvl w:ilvl="6" w:tentative="1">
+      <w:start w:val="1"/>
+      <w:numFmt w:val="bullet"/>
+      <w:lvlText w:val=""/>
+      <w:lvlJc w:val="left"/>
+      <w:pPr>
+        <w:tabs>
+          <w:tab w:val="num" w:pos="5040"/>
+        </w:tabs>
+        <w:ind w:left="5040" w:hanging="360"/>
+      </w:pPr>
+      <w:rPr>
+        <w:rFonts w:ascii="Wingdings" w:hAnsi="Wingdings" w:hint="default"/>
+        <w:sz w:val="20"/>
+      </w:rPr>
+    </w:lvl>
+    <w:lvl w:ilvl="7" w:tentative="1">
+      <w:start w:val="1"/>
+      <w:numFmt w:val="bullet"/>
+      <w:lvlText w:val=""/>
+      <w:lvlJc w:val="left"/>
+      <w:pPr>
+        <w:tabs>
+          <w:tab w:val="num" w:pos="5760"/>
+        </w:tabs>
+        <w:ind w:left="5760" w:hanging="360"/>
+      </w:pPr>
+      <w:rPr>
+        <w:rFonts w:ascii="Wingdings" w:hAnsi="Wingdings" w:hint="default"/>
+        <w:sz w:val="20"/>
+      </w:rPr>
+    </w:lvl>
+    <w:lvl w:ilvl="8" w:tentative="1">
+      <w:start w:val="1"/>
+      <w:numFmt w:val="bullet"/>
+      <w:lvlText w:val=""/>
+      <w:lvlJc w:val="left"/>
+      <w:pPr>
+        <w:tabs>
+          <w:tab w:val="num" w:pos="6480"/>
+        </w:tabs>
+        <w:ind w:left="6480" w:hanging="360"/>
+      </w:pPr>
+      <w:rPr>
+        <w:rFonts w:ascii="Wingdings" w:hAnsi="Wingdings" w:hint="default"/>
+        <w:sz w:val="20"/>
+      </w:rPr>
+    </w:lvl>
+  </w:abstractNum>
+  <w:abstractNum w:abstractNumId="3" w15:restartNumberingAfterBreak="0">
+    <w:nsid w:val="2E3615A5"/>
+    <w:multiLevelType w:val="multilevel"/>
+    <w:tmpl w:val="0D1098B2"/>
+    <w:lvl w:ilvl="0">
+      <w:start w:val="1"/>
+      <w:numFmt w:val="bullet"/>
+      <w:lvlText w:val=""/>
+      <w:lvlJc w:val="left"/>
+      <w:pPr>
+        <w:tabs>
+          <w:tab w:val="num" w:pos="720"/>
+        </w:tabs>
+        <w:ind w:left="720" w:hanging="360"/>
+      </w:pPr>
+      <w:rPr>
+        <w:rFonts w:ascii="Symbol" w:hAnsi="Symbol" w:hint="default"/>
+        <w:sz w:val="20"/>
+      </w:rPr>
+    </w:lvl>
+    <w:lvl w:ilvl="1" w:tentative="1">
+      <w:start w:val="1"/>
+      <w:numFmt w:val="bullet"/>
+      <w:lvlText w:val="o"/>
+      <w:lvlJc w:val="left"/>
+      <w:pPr>
+        <w:tabs>
+          <w:tab w:val="num" w:pos="1440"/>
+        </w:tabs>
+        <w:ind w:left="1440" w:hanging="360"/>
+      </w:pPr>
+      <w:rPr>
+        <w:rFonts w:ascii="Courier New" w:hAnsi="Courier New" w:hint="default"/>
+        <w:sz w:val="20"/>
+      </w:rPr>
+    </w:lvl>
+    <w:lvl w:ilvl="2" w:tentative="1">
+      <w:start w:val="1"/>
+      <w:numFmt w:val="bullet"/>
+      <w:lvlText w:val=""/>
+      <w:lvlJc w:val="left"/>
+      <w:pPr>
+        <w:tabs>
+          <w:tab w:val="num" w:pos="2160"/>
+        </w:tabs>
+        <w:ind w:left="2160" w:hanging="360"/>
+      </w:pPr>
+      <w:rPr>
+        <w:rFonts w:ascii="Wingdings" w:hAnsi="Wingdings" w:hint="default"/>
+        <w:sz w:val="20"/>
+      </w:rPr>
+    </w:lvl>
+    <w:lvl w:ilvl="3" w:tentative="1">
+      <w:start w:val="1"/>
+      <w:numFmt w:val="bullet"/>
+      <w:lvlText w:val=""/>
+      <w:lvlJc w:val="left"/>
+      <w:pPr>
+        <w:tabs>
+          <w:tab w:val="num" w:pos="2880"/>
+        </w:tabs>
+        <w:ind w:left="2880" w:hanging="360"/>
+      </w:pPr>
+      <w:rPr>
+        <w:rFonts w:ascii="Wingdings" w:hAnsi="Wingdings" w:hint="default"/>
+        <w:sz w:val="20"/>
+      </w:rPr>
+    </w:lvl>
+    <w:lvl w:ilvl="4" w:tentative="1">
+      <w:start w:val="1"/>
+      <w:numFmt w:val="bullet"/>
+      <w:lvlText w:val=""/>
+      <w:lvlJc w:val="left"/>
+      <w:pPr>
+        <w:tabs>
+          <w:tab w:val="num" w:pos="3600"/>
+        </w:tabs>
+        <w:ind w:left="3600" w:hanging="360"/>
+      </w:pPr>
+      <w:rPr>
+        <w:rFonts w:ascii="Wingdings" w:hAnsi="Wingdings" w:hint="default"/>
+        <w:sz w:val="20"/>
+      </w:rPr>
+    </w:lvl>
+    <w:lvl w:ilvl="5" w:tentative="1">
+      <w:start w:val="1"/>
+      <w:numFmt w:val="bullet"/>
+      <w:lvlText w:val=""/>
+      <w:lvlJc w:val="left"/>
+      <w:pPr>
+        <w:tabs>
+          <w:tab w:val="num" w:pos="4320"/>
+        </w:tabs>
+        <w:ind w:left="4320" w:hanging="360"/>
+      </w:pPr>
+      <w:rPr>
+        <w:rFonts w:ascii="Wingdings" w:hAnsi="Wingdings" w:hint="default"/>
+        <w:sz w:val="20"/>
+      </w:rPr>
+    </w:lvl>
+    <w:lvl w:ilvl="6" w:tentative="1">
+      <w:start w:val="1"/>
+      <w:numFmt w:val="bullet"/>
+      <w:lvlText w:val=""/>
+      <w:lvlJc w:val="left"/>
+      <w:pPr>
+        <w:tabs>
+          <w:tab w:val="num" w:pos="5040"/>
+        </w:tabs>
+        <w:ind w:left="5040" w:hanging="360"/>
+      </w:pPr>
+      <w:rPr>
+        <w:rFonts w:ascii="Wingdings" w:hAnsi="Wingdings" w:hint="default"/>
+        <w:sz w:val="20"/>
+      </w:rPr>
+    </w:lvl>
+    <w:lvl w:ilvl="7" w:tentative="1">
+      <w:start w:val="1"/>
+      <w:numFmt w:val="bullet"/>
+      <w:lvlText w:val=""/>
+      <w:lvlJc w:val="left"/>
+      <w:pPr>
+        <w:tabs>
+          <w:tab w:val="num" w:pos="5760"/>
+        </w:tabs>
+        <w:ind w:left="5760" w:hanging="360"/>
+      </w:pPr>
+      <w:rPr>
+        <w:rFonts w:ascii="Wingdings" w:hAnsi="Wingdings" w:hint="default"/>
+        <w:sz w:val="20"/>
+      </w:rPr>
+    </w:lvl>
+    <w:lvl w:ilvl="8" w:tentative="1">
+      <w:start w:val="1"/>
+      <w:numFmt w:val="bullet"/>
+      <w:lvlText w:val=""/>
+      <w:lvlJc w:val="left"/>
+      <w:pPr>
+        <w:tabs>
+          <w:tab w:val="num" w:pos="6480"/>
+        </w:tabs>
+        <w:ind w:left="6480" w:hanging="360"/>
+      </w:pPr>
+      <w:rPr>
+        <w:rFonts w:ascii="Wingdings" w:hAnsi="Wingdings" w:hint="default"/>
+        <w:sz w:val="20"/>
+      </w:rPr>
+    </w:lvl>
+  </w:abstractNum>
+  <w:abstractNum w:abstractNumId="4" w15:restartNumberingAfterBreak="0">
+    <w:nsid w:val="3FBF359A"/>
+    <w:multiLevelType w:val="multilevel"/>
+    <w:tmpl w:val="4A8069E0"/>
+    <w:lvl w:ilvl="0">
+      <w:start w:val="1"/>
+      <w:numFmt w:val="bullet"/>
+      <w:lvlText w:val=""/>
+      <w:lvlJc w:val="left"/>
+      <w:pPr>
+        <w:tabs>
+          <w:tab w:val="num" w:pos="720"/>
+        </w:tabs>
+        <w:ind w:left="720" w:hanging="360"/>
+      </w:pPr>
+      <w:rPr>
+        <w:rFonts w:ascii="Symbol" w:hAnsi="Symbol" w:hint="default"/>
+        <w:sz w:val="20"/>
+      </w:rPr>
+    </w:lvl>
+    <w:lvl w:ilvl="1" w:tentative="1">
+      <w:start w:val="1"/>
+      <w:numFmt w:val="bullet"/>
+      <w:lvlText w:val="o"/>
+      <w:lvlJc w:val="left"/>
+      <w:pPr>
+        <w:tabs>
+          <w:tab w:val="num" w:pos="1440"/>
+        </w:tabs>
+        <w:ind w:left="1440" w:hanging="360"/>
+      </w:pPr>
+      <w:rPr>
+        <w:rFonts w:ascii="Courier New" w:hAnsi="Courier New" w:hint="default"/>
+        <w:sz w:val="20"/>
+      </w:rPr>
+    </w:lvl>
+    <w:lvl w:ilvl="2" w:tentative="1">
+      <w:start w:val="1"/>
+      <w:numFmt w:val="bullet"/>
+      <w:lvlText w:val=""/>
+      <w:lvlJc w:val="left"/>
+      <w:pPr>
+        <w:tabs>
+          <w:tab w:val="num" w:pos="2160"/>
+        </w:tabs>
+        <w:ind w:left="2160" w:hanging="360"/>
+      </w:pPr>
+      <w:rPr>
+        <w:rFonts w:ascii="Wingdings" w:hAnsi="Wingdings" w:hint="default"/>
+        <w:sz w:val="20"/>
+      </w:rPr>
+    </w:lvl>
+    <w:lvl w:ilvl="3" w:tentative="1">
+      <w:start w:val="1"/>
+      <w:numFmt w:val="bullet"/>
+      <w:lvlText w:val=""/>
+      <w:lvlJc w:val="left"/>
+      <w:pPr>
+        <w:tabs>
+          <w:tab w:val="num" w:pos="2880"/>
+        </w:tabs>
+        <w:ind w:left="2880" w:hanging="360"/>
+      </w:pPr>
+      <w:rPr>
+        <w:rFonts w:ascii="Wingdings" w:hAnsi="Wingdings" w:hint="default"/>
+        <w:sz w:val="20"/>
+      </w:rPr>
+    </w:lvl>
+    <w:lvl w:ilvl="4" w:tentative="1">
+      <w:start w:val="1"/>
+      <w:numFmt w:val="bullet"/>
+      <w:lvlText w:val=""/>
+      <w:lvlJc w:val="left"/>
+      <w:pPr>
+        <w:tabs>
+          <w:tab w:val="num" w:pos="3600"/>
+        </w:tabs>
+        <w:ind w:left="3600" w:hanging="360"/>
+      </w:pPr>
+      <w:rPr>
+        <w:rFonts w:ascii="Wingdings" w:hAnsi="Wingdings" w:hint="default"/>
+        <w:sz w:val="20"/>
+      </w:rPr>
+    </w:lvl>
+    <w:lvl w:ilvl="5" w:tentative="1">
+      <w:start w:val="1"/>
+      <w:numFmt w:val="bullet"/>
+      <w:lvlText w:val=""/>
+      <w:lvlJc w:val="left"/>
+      <w:pPr>
+        <w:tabs>
+          <w:tab w:val="num" w:pos="4320"/>
+        </w:tabs>
+        <w:ind w:left="4320" w:hanging="360"/>
+      </w:pPr>
+      <w:rPr>
+        <w:rFonts w:ascii="Wingdings" w:hAnsi="Wingdings" w:hint="default"/>
+        <w:sz w:val="20"/>
+      </w:rPr>
+    </w:lvl>
+    <w:lvl w:ilvl="6" w:tentative="1">
+      <w:start w:val="1"/>
+      <w:numFmt w:val="bullet"/>
+      <w:lvlText w:val=""/>
+      <w:lvlJc w:val="left"/>
+      <w:pPr>
+        <w:tabs>
+          <w:tab w:val="num" w:pos="5040"/>
+        </w:tabs>
+        <w:ind w:left="5040" w:hanging="360"/>
+      </w:pPr>
+      <w:rPr>
+        <w:rFonts w:ascii="Wingdings" w:hAnsi="Wingdings" w:hint="default"/>
+        <w:sz w:val="20"/>
+      </w:rPr>
+    </w:lvl>
+    <w:lvl w:ilvl="7" w:tentative="1">
+      <w:start w:val="1"/>
+      <w:numFmt w:val="bullet"/>
+      <w:lvlText w:val=""/>
+      <w:lvlJc w:val="left"/>
+      <w:pPr>
+        <w:tabs>
+          <w:tab w:val="num" w:pos="5760"/>
+        </w:tabs>
+        <w:ind w:left="5760" w:hanging="360"/>
+      </w:pPr>
+      <w:rPr>
+        <w:rFonts w:ascii="Wingdings" w:hAnsi="Wingdings" w:hint="default"/>
+        <w:sz w:val="20"/>
+      </w:rPr>
+    </w:lvl>
+    <w:lvl w:ilvl="8" w:tentative="1">
+      <w:start w:val="1"/>
+      <w:numFmt w:val="bullet"/>
+      <w:lvlText w:val=""/>
+      <w:lvlJc w:val="left"/>
+      <w:pPr>
+        <w:tabs>
+          <w:tab w:val="num" w:pos="6480"/>
+        </w:tabs>
+        <w:ind w:left="6480" w:hanging="360"/>
+      </w:pPr>
+      <w:rPr>
+        <w:rFonts w:ascii="Wingdings" w:hAnsi="Wingdings" w:hint="default"/>
+        <w:sz w:val="20"/>
+      </w:rPr>
+    </w:lvl>
+  </w:abstractNum>
+  <w:abstractNum w:abstractNumId="5" w15:restartNumberingAfterBreak="0">
     <w:nsid w:val="4D463A0C"/>
     <w:multiLevelType w:val="hybridMultilevel"/>
     <w:tmpl w:val="42DA1C98"/>
@@ -12069,7 +13303,7 @@
       </w:rPr>
     </w:lvl>
   </w:abstractNum>
-  <w:abstractNum w:abstractNumId="1" w15:restartNumberingAfterBreak="0">
+  <w:abstractNum w:abstractNumId="6" w15:restartNumberingAfterBreak="0">
     <w:nsid w:val="546F7DAF"/>
     <w:multiLevelType w:val="hybridMultilevel"/>
     <w:tmpl w:val="E31AF332"/>
@@ -12123,7 +13357,156 @@
       <w:lvlJc w:val="left"/>
     </w:lvl>
   </w:abstractNum>
-  <w:abstractNum w:abstractNumId="2" w15:restartNumberingAfterBreak="0">
+  <w:abstractNum w:abstractNumId="7" w15:restartNumberingAfterBreak="0">
+    <w:nsid w:val="59F96017"/>
+    <w:multiLevelType w:val="multilevel"/>
+    <w:tmpl w:val="28E8D39C"/>
+    <w:lvl w:ilvl="0">
+      <w:start w:val="1"/>
+      <w:numFmt w:val="bullet"/>
+      <w:lvlText w:val=""/>
+      <w:lvlJc w:val="left"/>
+      <w:pPr>
+        <w:tabs>
+          <w:tab w:val="num" w:pos="720"/>
+        </w:tabs>
+        <w:ind w:left="720" w:hanging="360"/>
+      </w:pPr>
+      <w:rPr>
+        <w:rFonts w:ascii="Symbol" w:hAnsi="Symbol" w:hint="default"/>
+        <w:sz w:val="20"/>
+      </w:rPr>
+    </w:lvl>
+    <w:lvl w:ilvl="1" w:tentative="1">
+      <w:start w:val="1"/>
+      <w:numFmt w:val="bullet"/>
+      <w:lvlText w:val="o"/>
+      <w:lvlJc w:val="left"/>
+      <w:pPr>
+        <w:tabs>
+          <w:tab w:val="num" w:pos="1440"/>
+        </w:tabs>
+        <w:ind w:left="1440" w:hanging="360"/>
+      </w:pPr>
+      <w:rPr>
+        <w:rFonts w:ascii="Courier New" w:hAnsi="Courier New" w:hint="default"/>
+        <w:sz w:val="20"/>
+      </w:rPr>
+    </w:lvl>
+    <w:lvl w:ilvl="2" w:tentative="1">
+      <w:start w:val="1"/>
+      <w:numFmt w:val="bullet"/>
+      <w:lvlText w:val=""/>
+      <w:lvlJc w:val="left"/>
+      <w:pPr>
+        <w:tabs>
+          <w:tab w:val="num" w:pos="2160"/>
+        </w:tabs>
+        <w:ind w:left="2160" w:hanging="360"/>
+      </w:pPr>
+      <w:rPr>
+        <w:rFonts w:ascii="Wingdings" w:hAnsi="Wingdings" w:hint="default"/>
+        <w:sz w:val="20"/>
+      </w:rPr>
+    </w:lvl>
+    <w:lvl w:ilvl="3" w:tentative="1">
+      <w:start w:val="1"/>
+      <w:numFmt w:val="bullet"/>
+      <w:lvlText w:val=""/>
+      <w:lvlJc w:val="left"/>
+      <w:pPr>
+        <w:tabs>
+          <w:tab w:val="num" w:pos="2880"/>
+        </w:tabs>
+        <w:ind w:left="2880" w:hanging="360"/>
+      </w:pPr>
+      <w:rPr>
+        <w:rFonts w:ascii="Wingdings" w:hAnsi="Wingdings" w:hint="default"/>
+        <w:sz w:val="20"/>
+      </w:rPr>
+    </w:lvl>
+    <w:lvl w:ilvl="4" w:tentative="1">
+      <w:start w:val="1"/>
+      <w:numFmt w:val="bullet"/>
+      <w:lvlText w:val=""/>
+      <w:lvlJc w:val="left"/>
+      <w:pPr>
+        <w:tabs>
+          <w:tab w:val="num" w:pos="3600"/>
+        </w:tabs>
+        <w:ind w:left="3600" w:hanging="360"/>
+      </w:pPr>
+      <w:rPr>
+        <w:rFonts w:ascii="Wingdings" w:hAnsi="Wingdings" w:hint="default"/>
+        <w:sz w:val="20"/>
+      </w:rPr>
+    </w:lvl>
+    <w:lvl w:ilvl="5" w:tentative="1">
+      <w:start w:val="1"/>
+      <w:numFmt w:val="bullet"/>
+      <w:lvlText w:val=""/>
+      <w:lvlJc w:val="left"/>
+      <w:pPr>
+        <w:tabs>
+          <w:tab w:val="num" w:pos="4320"/>
+        </w:tabs>
+        <w:ind w:left="4320" w:hanging="360"/>
+      </w:pPr>
+      <w:rPr>
+        <w:rFonts w:ascii="Wingdings" w:hAnsi="Wingdings" w:hint="default"/>
+        <w:sz w:val="20"/>
+      </w:rPr>
+    </w:lvl>
+    <w:lvl w:ilvl="6" w:tentative="1">
+      <w:start w:val="1"/>
+      <w:numFmt w:val="bullet"/>
+      <w:lvlText w:val=""/>
+      <w:lvlJc w:val="left"/>
+      <w:pPr>
+        <w:tabs>
+          <w:tab w:val="num" w:pos="5040"/>
+        </w:tabs>
+        <w:ind w:left="5040" w:hanging="360"/>
+      </w:pPr>
+      <w:rPr>
+        <w:rFonts w:ascii="Wingdings" w:hAnsi="Wingdings" w:hint="default"/>
+        <w:sz w:val="20"/>
+      </w:rPr>
+    </w:lvl>
+    <w:lvl w:ilvl="7" w:tentative="1">
+      <w:start w:val="1"/>
+      <w:numFmt w:val="bullet"/>
+      <w:lvlText w:val=""/>
+      <w:lvlJc w:val="left"/>
+      <w:pPr>
+        <w:tabs>
+          <w:tab w:val="num" w:pos="5760"/>
+        </w:tabs>
+        <w:ind w:left="5760" w:hanging="360"/>
+      </w:pPr>
+      <w:rPr>
+        <w:rFonts w:ascii="Wingdings" w:hAnsi="Wingdings" w:hint="default"/>
+        <w:sz w:val="20"/>
+      </w:rPr>
+    </w:lvl>
+    <w:lvl w:ilvl="8" w:tentative="1">
+      <w:start w:val="1"/>
+      <w:numFmt w:val="bullet"/>
+      <w:lvlText w:val=""/>
+      <w:lvlJc w:val="left"/>
+      <w:pPr>
+        <w:tabs>
+          <w:tab w:val="num" w:pos="6480"/>
+        </w:tabs>
+        <w:ind w:left="6480" w:hanging="360"/>
+      </w:pPr>
+      <w:rPr>
+        <w:rFonts w:ascii="Wingdings" w:hAnsi="Wingdings" w:hint="default"/>
+        <w:sz w:val="20"/>
+      </w:rPr>
+    </w:lvl>
+  </w:abstractNum>
+  <w:abstractNum w:abstractNumId="8" w15:restartNumberingAfterBreak="0">
     <w:nsid w:val="5C3B004E"/>
     <w:multiLevelType w:val="hybridMultilevel"/>
     <w:tmpl w:val="C4A456F0"/>
@@ -12189,7 +13572,7 @@
       <w:lvlJc w:val="left"/>
     </w:lvl>
   </w:abstractNum>
-  <w:abstractNum w:abstractNumId="3" w15:restartNumberingAfterBreak="0">
+  <w:abstractNum w:abstractNumId="9" w15:restartNumberingAfterBreak="0">
     <w:nsid w:val="68943C4F"/>
     <w:multiLevelType w:val="hybridMultilevel"/>
     <w:tmpl w:val="81E6B944"/>
@@ -12276,25 +13659,43 @@
     </w:lvl>
   </w:abstractNum>
   <w:num w:numId="1" w16cid:durableId="1056930727">
-    <w:abstractNumId w:val="3"/>
+    <w:abstractNumId w:val="9"/>
     <w:lvlOverride w:ilvl="0">
       <w:startOverride w:val="1"/>
     </w:lvlOverride>
   </w:num>
   <w:num w:numId="2" w16cid:durableId="1070809909">
-    <w:abstractNumId w:val="2"/>
+    <w:abstractNumId w:val="8"/>
     <w:lvlOverride w:ilvl="0">
       <w:startOverride w:val="1"/>
     </w:lvlOverride>
   </w:num>
   <w:num w:numId="3" w16cid:durableId="1876651922">
-    <w:abstractNumId w:val="1"/>
+    <w:abstractNumId w:val="6"/>
     <w:lvlOverride w:ilvl="0">
       <w:startOverride w:val="1"/>
     </w:lvlOverride>
   </w:num>
   <w:num w:numId="4" w16cid:durableId="335769295">
+    <w:abstractNumId w:val="5"/>
+  </w:num>
+  <w:num w:numId="5" w16cid:durableId="1172990831">
+    <w:abstractNumId w:val="3"/>
+  </w:num>
+  <w:num w:numId="6" w16cid:durableId="608585289">
+    <w:abstractNumId w:val="4"/>
+  </w:num>
+  <w:num w:numId="7" w16cid:durableId="1635597421">
+    <w:abstractNumId w:val="7"/>
+  </w:num>
+  <w:num w:numId="8" w16cid:durableId="1914779456">
     <w:abstractNumId w:val="0"/>
+  </w:num>
+  <w:num w:numId="9" w16cid:durableId="638268862">
+    <w:abstractNumId w:val="1"/>
+  </w:num>
+  <w:num w:numId="10" w16cid:durableId="384766504">
+    <w:abstractNumId w:val="2"/>
   </w:num>
 </w:numbering>
 </file>
@@ -12790,7 +14191,6 @@
   <w:style w:type="character" w:default="1" w:styleId="Absatz-Standardschriftart">
     <w:name w:val="Default Paragraph Font"/>
     <w:uiPriority w:val="1"/>
-    <w:semiHidden/>
     <w:unhideWhenUsed/>
   </w:style>
   <w:style w:type="table" w:default="1" w:styleId="NormaleTabelle">

</xml_diff>